<commit_message>
QC round on all documents; add proposal, cover letter and ADR-013
Regenerate all 66 documents in Word and PDF after a full content QC
against the current code (statuses, endpoints, permissions, flows, test
results) with new typography: embedded Inter in PDFs, Calibri in Word, no
mid-word breaks in IDs, landscape pages for wide tables. Add ADR-013 (TASCO
core as rating master) and the core integration contract. Commercials
rebased to a USD 94,800 fixed-price MVP within the USD 100,000 budget.
Test workbook regenerated from a fresh run; NFT cases that only had a
smoke load test are now Not Run. Add the client proposal and cover letter.

Co-Authored-By: Claude Opus 5.5 <noreply@anthropic.com>
Claude-Session: https://claude.ai/code/session_01JKboFEjK8WnRLrewyCKcAM
</commit_message>
<xml_diff>
--- a/docs/architecture/00-index.docx
+++ b/docs/architecture/00-index.docx
@@ -7,7 +7,7 @@
         <w:pStyle w:val="Title"/>
       </w:pPr>
       <w:r>
-        <w:t xml:space="preserve">Architecture documentation — TASCO Growth Platform</w:t>
+        <w:t xml:space="preserve">Architecture Documentation — TASCO Growth Platform</w:t>
       </w:r>
     </w:p>
     <w:p>
@@ -60,9 +60,214 @@
         </w:p>
       </w:sdtContent>
     </w:sdt>
+    <w:tbl>
+      <w:tblPr>
+        <w:tblStyle w:val="Table"/>
+        <w:tblW w:type="pct" w:w="5000"/>
+        <w:tblLook w:firstRow="1" w:lastRow="0" w:firstColumn="0" w:lastColumn="0" w:noHBand="0" w:noVBand="0" w:val="0020"/>
+        <w:jc w:val="start"/>
+      </w:tblPr>
+      <w:tblGrid>
+        <w:gridCol w:w="1584"/>
+        <w:gridCol w:w="1584"/>
+        <w:gridCol w:w="1584"/>
+        <w:gridCol w:w="1584"/>
+        <w:gridCol w:w="1584"/>
+      </w:tblGrid>
+      <w:tr>
+        <w:trPr>
+          <w:tblHeader w:val="true"/>
+          <w:tblHeader w:val="true"/>
+        </w:trPr>
+        <w:tc>
+          <w:tcPr>
+            <w:shd w:val="clear" w:color="auto" w:fill="213368"/>
+          </w:tcPr>
+          <w:p>
+            <w:pPr>
+              <w:pStyle w:val="Compact"/>
+              <w:spacing w:before="20" w:after="20"/>
+              <w:jc w:val="left"/>
+            </w:pPr>
+            <w:r>
+              <w:rPr>
+                <w:b/>
+                <w:color w:val="FFFFFF"/>
+                <w:sz w:val="17"/>
+              </w:rPr>
+              <w:t xml:space="preserve">Document</w:t>
+            </w:r>
+          </w:p>
+        </w:tc>
+        <w:tc>
+          <w:tcPr>
+            <w:shd w:val="clear" w:color="auto" w:fill="213368"/>
+          </w:tcPr>
+          <w:p>
+            <w:pPr>
+              <w:pStyle w:val="Compact"/>
+              <w:spacing w:before="20" w:after="20"/>
+              <w:jc w:val="left"/>
+            </w:pPr>
+            <w:r>
+              <w:rPr>
+                <w:b/>
+                <w:color w:val="FFFFFF"/>
+                <w:sz w:val="17"/>
+              </w:rPr>
+              <w:t xml:space="preserve">Version</w:t>
+            </w:r>
+          </w:p>
+        </w:tc>
+        <w:tc>
+          <w:tcPr>
+            <w:shd w:val="clear" w:color="auto" w:fill="213368"/>
+          </w:tcPr>
+          <w:p>
+            <w:pPr>
+              <w:pStyle w:val="Compact"/>
+              <w:spacing w:before="20" w:after="20"/>
+              <w:jc w:val="left"/>
+            </w:pPr>
+            <w:r>
+              <w:rPr>
+                <w:b/>
+                <w:color w:val="FFFFFF"/>
+                <w:sz w:val="17"/>
+              </w:rPr>
+              <w:t xml:space="preserve">Date</w:t>
+            </w:r>
+          </w:p>
+        </w:tc>
+        <w:tc>
+          <w:tcPr>
+            <w:shd w:val="clear" w:color="auto" w:fill="213368"/>
+          </w:tcPr>
+          <w:p>
+            <w:pPr>
+              <w:pStyle w:val="Compact"/>
+              <w:spacing w:before="20" w:after="20"/>
+              <w:jc w:val="left"/>
+            </w:pPr>
+            <w:r>
+              <w:rPr>
+                <w:b/>
+                <w:color w:val="FFFFFF"/>
+                <w:sz w:val="17"/>
+              </w:rPr>
+              <w:t xml:space="preserve">Owner</w:t>
+            </w:r>
+          </w:p>
+        </w:tc>
+        <w:tc>
+          <w:tcPr>
+            <w:shd w:val="clear" w:color="auto" w:fill="213368"/>
+          </w:tcPr>
+          <w:p>
+            <w:pPr>
+              <w:pStyle w:val="Compact"/>
+              <w:spacing w:before="20" w:after="20"/>
+              <w:jc w:val="left"/>
+            </w:pPr>
+            <w:r>
+              <w:rPr>
+                <w:b/>
+                <w:color w:val="FFFFFF"/>
+                <w:sz w:val="17"/>
+              </w:rPr>
+              <w:t xml:space="preserve">Status</w:t>
+            </w:r>
+          </w:p>
+        </w:tc>
+      </w:tr>
+      <w:tr>
+        <w:tc>
+          <w:tcPr/>
+          <w:p>
+            <w:pPr>
+              <w:pStyle w:val="Compact"/>
+              <w:spacing w:before="20" w:after="20"/>
+              <w:jc w:val="left"/>
+            </w:pPr>
+            <w:r>
+              <w:rPr>
+                <w:sz w:val="17"/>
+              </w:rPr>
+              <w:t xml:space="preserve">Architecture documentation index</w:t>
+            </w:r>
+          </w:p>
+        </w:tc>
+        <w:tc>
+          <w:tcPr>
+            <w:noWrap/>
+          </w:tcPr>
+          <w:p>
+            <w:pPr>
+              <w:pStyle w:val="Compact"/>
+              <w:spacing w:before="20" w:after="20"/>
+              <w:jc w:val="left"/>
+            </w:pPr>
+            <w:r>
+              <w:rPr>
+                <w:sz w:val="17"/>
+              </w:rPr>
+              <w:t xml:space="preserve">1.0</w:t>
+            </w:r>
+          </w:p>
+        </w:tc>
+        <w:tc>
+          <w:tcPr/>
+          <w:p>
+            <w:pPr>
+              <w:pStyle w:val="Compact"/>
+              <w:spacing w:before="20" w:after="20"/>
+              <w:jc w:val="left"/>
+            </w:pPr>
+            <w:r>
+              <w:rPr>
+                <w:sz w:val="17"/>
+              </w:rPr>
+              <w:t xml:space="preserve">07 October 2026</w:t>
+            </w:r>
+          </w:p>
+        </w:tc>
+        <w:tc>
+          <w:tcPr/>
+          <w:p>
+            <w:pPr>
+              <w:pStyle w:val="Compact"/>
+              <w:spacing w:before="20" w:after="20"/>
+              <w:jc w:val="left"/>
+            </w:pPr>
+            <w:r>
+              <w:rPr>
+                <w:sz w:val="17"/>
+              </w:rPr>
+              <w:t xml:space="preserve">iorta TechNXT Architecture</w:t>
+            </w:r>
+          </w:p>
+        </w:tc>
+        <w:tc>
+          <w:tcPr/>
+          <w:p>
+            <w:pPr>
+              <w:pStyle w:val="Compact"/>
+              <w:spacing w:before="20" w:after="20"/>
+              <w:jc w:val="left"/>
+            </w:pPr>
+            <w:r>
+              <w:rPr>
+                <w:sz w:val="17"/>
+              </w:rPr>
+              <w:t xml:space="preserve">Issued for submission</w:t>
+            </w:r>
+          </w:p>
+        </w:tc>
+      </w:tr>
+    </w:tbl>
     <w:p>
       <w:pPr>
-        <w:pStyle w:val="FirstParagraph"/>
+        <w:pStyle w:val="BodyText"/>
       </w:pPr>
       <w:r>
         <w:t xml:space="preserve">TASCO Insurance × VETC motor insurance growth platform (new business, renewals, partners, claims FNOL), built by iorta TechNXT.</w:t>
@@ -71,7 +276,19 @@
         <w:t xml:space="preserve"> </w:t>
       </w:r>
       <w:r>
-        <w:t xml:space="preserve">Runtime: Node.js 22, PostgreSQL 16 (or in-memory for dev/demo), one runtime dependency (</w:t>
+        <w:t xml:space="preserve">Runtime: Node.js 22, PostgreSQL 16 (an in-memory store is available for development and demonstrations only; production refuses to start without</w:t>
+      </w:r>
+      <w:r>
+        <w:t xml:space="preserve"> </w:t>
+      </w:r>
+      <w:r>
+        <w:rPr>
+          <w:rStyle w:val="VerbatimChar"/>
+        </w:rPr>
+        <w:t xml:space="preserve">DATABASE_URL</w:t>
+      </w:r>
+      <w:r>
+        <w:t xml:space="preserve">), one runtime dependency (</w:t>
       </w:r>
       <w:r>
         <w:rPr>
@@ -88,7 +305,7 @@
         <w:pStyle w:val="BodyText"/>
       </w:pPr>
       <w:r>
-        <w:t xml:space="preserve">Everything here is written from the source code. Each document cites the files it describes, so a reviewer can check every claim. Where the platform currently uses a</w:t>
+        <w:t xml:space="preserve">Every document in this set is written from the source code. Each document cites the files it describes, so a reviewer can check every claim. Where the platform currently uses a</w:t>
       </w:r>
       <w:r>
         <w:t xml:space="preserve"> </w:t>
@@ -154,12 +371,14 @@
           <w:p>
             <w:pPr>
               <w:pStyle w:val="Compact"/>
+              <w:spacing w:before="20" w:after="20"/>
               <w:jc w:val="left"/>
             </w:pPr>
             <w:r>
               <w:rPr>
                 <w:b/>
                 <w:color w:val="FFFFFF"/>
+                <w:sz w:val="18"/>
               </w:rPr>
               <w:t xml:space="preserve">#</w:t>
             </w:r>
@@ -172,12 +391,14 @@
           <w:p>
             <w:pPr>
               <w:pStyle w:val="Compact"/>
+              <w:spacing w:before="20" w:after="20"/>
               <w:jc w:val="left"/>
             </w:pPr>
             <w:r>
               <w:rPr>
                 <w:b/>
                 <w:color w:val="FFFFFF"/>
+                <w:sz w:val="18"/>
               </w:rPr>
               <w:t xml:space="preserve">Document</w:t>
             </w:r>
@@ -190,12 +411,14 @@
           <w:p>
             <w:pPr>
               <w:pStyle w:val="Compact"/>
+              <w:spacing w:before="20" w:after="20"/>
               <w:jc w:val="left"/>
             </w:pPr>
             <w:r>
               <w:rPr>
                 <w:b/>
                 <w:color w:val="FFFFFF"/>
+                <w:sz w:val="18"/>
               </w:rPr>
               <w:t xml:space="preserve">Audience</w:t>
             </w:r>
@@ -208,12 +431,14 @@
           <w:p>
             <w:pPr>
               <w:pStyle w:val="Compact"/>
+              <w:spacing w:before="20" w:after="20"/>
               <w:jc w:val="left"/>
             </w:pPr>
             <w:r>
               <w:rPr>
                 <w:b/>
                 <w:color w:val="FFFFFF"/>
+                <w:sz w:val="18"/>
               </w:rPr>
               <w:t xml:space="preserve">What it answers</w:t>
             </w:r>
@@ -222,13 +447,19 @@
       </w:tr>
       <w:tr>
         <w:tc>
-          <w:tcPr/>
-          <w:p>
-            <w:pPr>
-              <w:pStyle w:val="Compact"/>
-              <w:jc w:val="left"/>
-            </w:pPr>
-            <w:r>
+          <w:tcPr>
+            <w:noWrap/>
+          </w:tcPr>
+          <w:p>
+            <w:pPr>
+              <w:pStyle w:val="Compact"/>
+              <w:spacing w:before="20" w:after="20"/>
+              <w:jc w:val="left"/>
+            </w:pPr>
+            <w:r>
+              <w:rPr>
+                <w:sz w:val="18"/>
+              </w:rPr>
               <w:t xml:space="preserve">1</w:t>
             </w:r>
           </w:p>
@@ -238,6 +469,7 @@
           <w:p>
             <w:pPr>
               <w:pStyle w:val="Compact"/>
+              <w:spacing w:before="20" w:after="20"/>
               <w:jc w:val="left"/>
             </w:pPr>
             <w:hyperlink r:id="rId20">
@@ -245,7 +477,7 @@
                 <w:rPr>
                   <w:rStyle w:val="Hyperlink"/>
                 </w:rPr>
-                <w:t xml:space="preserve">Solution architecture</w:t>
+                <w:t xml:space="preserve">Solution Architecture</w:t>
               </w:r>
             </w:hyperlink>
           </w:p>
@@ -255,9 +487,13 @@
           <w:p>
             <w:pPr>
               <w:pStyle w:val="Compact"/>
-              <w:jc w:val="left"/>
-            </w:pPr>
-            <w:r>
+              <w:spacing w:before="20" w:after="20"/>
+              <w:jc w:val="left"/>
+            </w:pPr>
+            <w:r>
+              <w:rPr>
+                <w:sz w:val="18"/>
+              </w:rPr>
               <w:t xml:space="preserve">CTO, architects, delivery leads</w:t>
             </w:r>
           </w:p>
@@ -267,23 +503,33 @@
           <w:p>
             <w:pPr>
               <w:pStyle w:val="Compact"/>
-              <w:jc w:val="left"/>
-            </w:pPr>
-            <w:r>
-              <w:t xml:space="preserve">Principles, C4 views, hexagonal layering, key flows, event catalogue, configurability model, scaling to 6M vehicles, roadmap</w:t>
+              <w:spacing w:before="20" w:after="20"/>
+              <w:jc w:val="left"/>
+            </w:pPr>
+            <w:r>
+              <w:rPr>
+                <w:sz w:val="18"/>
+              </w:rPr>
+              <w:t xml:space="preserve">Principles, C4 views, hexagonal layering, key flows, event catalogue, configurability, scaling to 6 M vehicles, roadmap</w:t>
             </w:r>
           </w:p>
         </w:tc>
       </w:tr>
       <w:tr>
         <w:tc>
-          <w:tcPr/>
-          <w:p>
-            <w:pPr>
-              <w:pStyle w:val="Compact"/>
-              <w:jc w:val="left"/>
-            </w:pPr>
-            <w:r>
+          <w:tcPr>
+            <w:noWrap/>
+          </w:tcPr>
+          <w:p>
+            <w:pPr>
+              <w:pStyle w:val="Compact"/>
+              <w:spacing w:before="20" w:after="20"/>
+              <w:jc w:val="left"/>
+            </w:pPr>
+            <w:r>
+              <w:rPr>
+                <w:sz w:val="18"/>
+              </w:rPr>
               <w:t xml:space="preserve">2</w:t>
             </w:r>
           </w:p>
@@ -293,6 +539,75 @@
           <w:p>
             <w:pPr>
               <w:pStyle w:val="Compact"/>
+              <w:spacing w:before="20" w:after="20"/>
+              <w:jc w:val="left"/>
+            </w:pPr>
+            <w:r>
+              <w:rPr>
+                <w:sz w:val="18"/>
+              </w:rPr>
+              <w:t xml:space="preserve">Architecture decision records (see the ADR index below)</w:t>
+            </w:r>
+          </w:p>
+        </w:tc>
+        <w:tc>
+          <w:tcPr/>
+          <w:p>
+            <w:pPr>
+              <w:pStyle w:val="Compact"/>
+              <w:spacing w:before="20" w:after="20"/>
+              <w:jc w:val="left"/>
+            </w:pPr>
+            <w:r>
+              <w:rPr>
+                <w:sz w:val="18"/>
+              </w:rPr>
+              <w:t xml:space="preserve">Architects, tech leads, auditors</w:t>
+            </w:r>
+          </w:p>
+        </w:tc>
+        <w:tc>
+          <w:tcPr/>
+          <w:p>
+            <w:pPr>
+              <w:pStyle w:val="Compact"/>
+              <w:spacing w:before="20" w:after="20"/>
+              <w:jc w:val="left"/>
+            </w:pPr>
+            <w:r>
+              <w:rPr>
+                <w:sz w:val="18"/>
+              </w:rPr>
+              <w:t xml:space="preserve">The 12 decisions that shape the platform, with alternatives and consequences</w:t>
+            </w:r>
+          </w:p>
+        </w:tc>
+      </w:tr>
+      <w:tr>
+        <w:tc>
+          <w:tcPr>
+            <w:noWrap/>
+          </w:tcPr>
+          <w:p>
+            <w:pPr>
+              <w:pStyle w:val="Compact"/>
+              <w:spacing w:before="20" w:after="20"/>
+              <w:jc w:val="left"/>
+            </w:pPr>
+            <w:r>
+              <w:rPr>
+                <w:sz w:val="18"/>
+              </w:rPr>
+              <w:t xml:space="preserve">3</w:t>
+            </w:r>
+          </w:p>
+        </w:tc>
+        <w:tc>
+          <w:tcPr/>
+          <w:p>
+            <w:pPr>
+              <w:pStyle w:val="Compact"/>
+              <w:spacing w:before="20" w:after="20"/>
               <w:jc w:val="left"/>
             </w:pPr>
             <w:hyperlink r:id="rId21">
@@ -300,7 +615,7 @@
                 <w:rPr>
                   <w:rStyle w:val="Hyperlink"/>
                 </w:rPr>
-                <w:t xml:space="preserve">Architecture decision records</w:t>
+                <w:t xml:space="preserve">Integration Architecture</w:t>
               </w:r>
             </w:hyperlink>
           </w:p>
@@ -310,44 +625,59 @@
           <w:p>
             <w:pPr>
               <w:pStyle w:val="Compact"/>
-              <w:jc w:val="left"/>
-            </w:pPr>
-            <w:r>
-              <w:t xml:space="preserve">Architects, tech leads, auditors</w:t>
-            </w:r>
-          </w:p>
-        </w:tc>
-        <w:tc>
-          <w:tcPr/>
-          <w:p>
-            <w:pPr>
-              <w:pStyle w:val="Compact"/>
-              <w:jc w:val="left"/>
-            </w:pPr>
-            <w:r>
-              <w:t xml:space="preserve">The 12 decisions that shape the platform, with alternatives and consequences</w:t>
+              <w:spacing w:before="20" w:after="20"/>
+              <w:jc w:val="left"/>
+            </w:pPr>
+            <w:r>
+              <w:rPr>
+                <w:sz w:val="18"/>
+              </w:rPr>
+              <w:t xml:space="preserve">Integration teams (VETC, TASCO core, Zalo, telco, voice-AI vendor, partners)</w:t>
+            </w:r>
+          </w:p>
+        </w:tc>
+        <w:tc>
+          <w:tcPr/>
+          <w:p>
+            <w:pPr>
+              <w:pStyle w:val="Compact"/>
+              <w:spacing w:before="20" w:after="20"/>
+              <w:jc w:val="left"/>
+            </w:pPr>
+            <w:r>
+              <w:rPr>
+                <w:sz w:val="18"/>
+              </w:rPr>
+              <w:t xml:space="preserve">Every port: contract, protocol, authentication, idempotency, resilience, SLA, sandbox vs production</w:t>
             </w:r>
           </w:p>
         </w:tc>
       </w:tr>
       <w:tr>
         <w:tc>
-          <w:tcPr/>
-          <w:p>
-            <w:pPr>
-              <w:pStyle w:val="Compact"/>
-              <w:jc w:val="left"/>
-            </w:pPr>
-            <w:r>
-              <w:t xml:space="preserve">3</w:t>
-            </w:r>
-          </w:p>
-        </w:tc>
-        <w:tc>
-          <w:tcPr/>
-          <w:p>
-            <w:pPr>
-              <w:pStyle w:val="Compact"/>
+          <w:tcPr>
+            <w:noWrap/>
+          </w:tcPr>
+          <w:p>
+            <w:pPr>
+              <w:pStyle w:val="Compact"/>
+              <w:spacing w:before="20" w:after="20"/>
+              <w:jc w:val="left"/>
+            </w:pPr>
+            <w:r>
+              <w:rPr>
+                <w:sz w:val="18"/>
+              </w:rPr>
+              <w:t xml:space="preserve">4</w:t>
+            </w:r>
+          </w:p>
+        </w:tc>
+        <w:tc>
+          <w:tcPr/>
+          <w:p>
+            <w:pPr>
+              <w:pStyle w:val="Compact"/>
+              <w:spacing w:before="20" w:after="20"/>
               <w:jc w:val="left"/>
             </w:pPr>
             <w:hyperlink r:id="rId22">
@@ -355,7 +685,7 @@
                 <w:rPr>
                   <w:rStyle w:val="Hyperlink"/>
                 </w:rPr>
-                <w:t xml:space="preserve">Integration architecture</w:t>
+                <w:t xml:space="preserve">Deployment and Infrastructure Architecture</w:t>
               </w:r>
             </w:hyperlink>
           </w:p>
@@ -365,44 +695,59 @@
           <w:p>
             <w:pPr>
               <w:pStyle w:val="Compact"/>
-              <w:jc w:val="left"/>
-            </w:pPr>
-            <w:r>
-              <w:t xml:space="preserve">Integration teams (VETC, TASCO core, Zalo, telco, voice-AI vendor, partners)</w:t>
-            </w:r>
-          </w:p>
-        </w:tc>
-        <w:tc>
-          <w:tcPr/>
-          <w:p>
-            <w:pPr>
-              <w:pStyle w:val="Compact"/>
-              <w:jc w:val="left"/>
-            </w:pPr>
-            <w:r>
-              <w:t xml:space="preserve">Every port: contract, protocol, auth, idempotency, resilience, SLA, sandbox vs production</w:t>
+              <w:spacing w:before="20" w:after="20"/>
+              <w:jc w:val="left"/>
+            </w:pPr>
+            <w:r>
+              <w:rPr>
+                <w:sz w:val="18"/>
+              </w:rPr>
+              <w:t xml:space="preserve">Platform/SRE, InfoSec, finance</w:t>
+            </w:r>
+          </w:p>
+        </w:tc>
+        <w:tc>
+          <w:tcPr/>
+          <w:p>
+            <w:pPr>
+              <w:pStyle w:val="Compact"/>
+              <w:spacing w:before="20" w:after="20"/>
+              <w:jc w:val="left"/>
+            </w:pPr>
+            <w:r>
+              <w:rPr>
+                <w:sz w:val="18"/>
+              </w:rPr>
+              <w:t xml:space="preserve">Environments, Kubernetes topology, network zones, PostgreSQL HA, secrets, CI/CD, capacity and cost, observability</w:t>
             </w:r>
           </w:p>
         </w:tc>
       </w:tr>
       <w:tr>
         <w:tc>
-          <w:tcPr/>
-          <w:p>
-            <w:pPr>
-              <w:pStyle w:val="Compact"/>
-              <w:jc w:val="left"/>
-            </w:pPr>
-            <w:r>
-              <w:t xml:space="preserve">4</w:t>
-            </w:r>
-          </w:p>
-        </w:tc>
-        <w:tc>
-          <w:tcPr/>
-          <w:p>
-            <w:pPr>
-              <w:pStyle w:val="Compact"/>
+          <w:tcPr>
+            <w:noWrap/>
+          </w:tcPr>
+          <w:p>
+            <w:pPr>
+              <w:pStyle w:val="Compact"/>
+              <w:spacing w:before="20" w:after="20"/>
+              <w:jc w:val="left"/>
+            </w:pPr>
+            <w:r>
+              <w:rPr>
+                <w:sz w:val="18"/>
+              </w:rPr>
+              <w:t xml:space="preserve">5</w:t>
+            </w:r>
+          </w:p>
+        </w:tc>
+        <w:tc>
+          <w:tcPr/>
+          <w:p>
+            <w:pPr>
+              <w:pStyle w:val="Compact"/>
+              <w:spacing w:before="20" w:after="20"/>
               <w:jc w:val="left"/>
             </w:pPr>
             <w:hyperlink r:id="rId23">
@@ -410,7 +755,7 @@
                 <w:rPr>
                   <w:rStyle w:val="Hyperlink"/>
                 </w:rPr>
-                <w:t xml:space="preserve">Deployment &amp; infrastructure</w:t>
+                <w:t xml:space="preserve">Data Architecture</w:t>
               </w:r>
             </w:hyperlink>
           </w:p>
@@ -420,44 +765,59 @@
           <w:p>
             <w:pPr>
               <w:pStyle w:val="Compact"/>
-              <w:jc w:val="left"/>
-            </w:pPr>
-            <w:r>
-              <w:t xml:space="preserve">Platform/SRE, InfoSec, finance</w:t>
-            </w:r>
-          </w:p>
-        </w:tc>
-        <w:tc>
-          <w:tcPr/>
-          <w:p>
-            <w:pPr>
-              <w:pStyle w:val="Compact"/>
-              <w:jc w:val="left"/>
-            </w:pPr>
-            <w:r>
-              <w:t xml:space="preserve">Environments, Kubernetes topology, network zones, Postgres HA, secrets, CI/CD, capacity and cost, observability</w:t>
+              <w:spacing w:before="20" w:after="20"/>
+              <w:jc w:val="left"/>
+            </w:pPr>
+            <w:r>
+              <w:rPr>
+                <w:sz w:val="18"/>
+              </w:rPr>
+              <w:t xml:space="preserve">Data office, DPO, data stewards, BI</w:t>
+            </w:r>
+          </w:p>
+        </w:tc>
+        <w:tc>
+          <w:tcPr/>
+          <w:p>
+            <w:pPr>
+              <w:pStyle w:val="Compact"/>
+              <w:spacing w:before="20" w:after="20"/>
+              <w:jc w:val="left"/>
+            </w:pPr>
+            <w:r>
+              <w:rPr>
+                <w:sz w:val="18"/>
+              </w:rPr>
+              <w:t xml:space="preserve">ERD, data dictionary, MDM/golden record, data quality, lineage, retention, migration, analytics feed</w:t>
             </w:r>
           </w:p>
         </w:tc>
       </w:tr>
       <w:tr>
         <w:tc>
-          <w:tcPr/>
-          <w:p>
-            <w:pPr>
-              <w:pStyle w:val="Compact"/>
-              <w:jc w:val="left"/>
-            </w:pPr>
-            <w:r>
-              <w:t xml:space="preserve">5</w:t>
-            </w:r>
-          </w:p>
-        </w:tc>
-        <w:tc>
-          <w:tcPr/>
-          <w:p>
-            <w:pPr>
-              <w:pStyle w:val="Compact"/>
+          <w:tcPr>
+            <w:noWrap/>
+          </w:tcPr>
+          <w:p>
+            <w:pPr>
+              <w:pStyle w:val="Compact"/>
+              <w:spacing w:before="20" w:after="20"/>
+              <w:jc w:val="left"/>
+            </w:pPr>
+            <w:r>
+              <w:rPr>
+                <w:sz w:val="18"/>
+              </w:rPr>
+              <w:t xml:space="preserve">6</w:t>
+            </w:r>
+          </w:p>
+        </w:tc>
+        <w:tc>
+          <w:tcPr/>
+          <w:p>
+            <w:pPr>
+              <w:pStyle w:val="Compact"/>
+              <w:spacing w:before="20" w:after="20"/>
               <w:jc w:val="left"/>
             </w:pPr>
             <w:hyperlink r:id="rId24">
@@ -465,7 +825,7 @@
                 <w:rPr>
                   <w:rStyle w:val="Hyperlink"/>
                 </w:rPr>
-                <w:t xml:space="preserve">Data architecture</w:t>
+                <w:t xml:space="preserve">Security Architecture</w:t>
               </w:r>
             </w:hyperlink>
           </w:p>
@@ -475,44 +835,59 @@
           <w:p>
             <w:pPr>
               <w:pStyle w:val="Compact"/>
-              <w:jc w:val="left"/>
-            </w:pPr>
-            <w:r>
-              <w:t xml:space="preserve">Data office, DPO, data stewards, BI</w:t>
-            </w:r>
-          </w:p>
-        </w:tc>
-        <w:tc>
-          <w:tcPr/>
-          <w:p>
-            <w:pPr>
-              <w:pStyle w:val="Compact"/>
-              <w:jc w:val="left"/>
-            </w:pPr>
-            <w:r>
-              <w:t xml:space="preserve">ERD, data dictionary, MDM/golden record, data quality, lineage, retention, migration, analytics feed</w:t>
+              <w:spacing w:before="20" w:after="20"/>
+              <w:jc w:val="left"/>
+            </w:pPr>
+            <w:r>
+              <w:rPr>
+                <w:sz w:val="18"/>
+              </w:rPr>
+              <w:t xml:space="preserve">CISO, InfoSec, penetration testers, auditors</w:t>
+            </w:r>
+          </w:p>
+        </w:tc>
+        <w:tc>
+          <w:tcPr/>
+          <w:p>
+            <w:pPr>
+              <w:pStyle w:val="Compact"/>
+              <w:spacing w:before="20" w:after="20"/>
+              <w:jc w:val="left"/>
+            </w:pPr>
+            <w:r>
+              <w:rPr>
+                <w:sz w:val="18"/>
+              </w:rPr>
+              <w:t xml:space="preserve">STRIDE threat model, OWASP Top 10 and ASVS L2 mapping, RBAC/ABAC, cryptography and keys, findings register</w:t>
             </w:r>
           </w:p>
         </w:tc>
       </w:tr>
       <w:tr>
         <w:tc>
-          <w:tcPr/>
-          <w:p>
-            <w:pPr>
-              <w:pStyle w:val="Compact"/>
-              <w:jc w:val="left"/>
-            </w:pPr>
-            <w:r>
-              <w:t xml:space="preserve">6</w:t>
-            </w:r>
-          </w:p>
-        </w:tc>
-        <w:tc>
-          <w:tcPr/>
-          <w:p>
-            <w:pPr>
-              <w:pStyle w:val="Compact"/>
+          <w:tcPr>
+            <w:noWrap/>
+          </w:tcPr>
+          <w:p>
+            <w:pPr>
+              <w:pStyle w:val="Compact"/>
+              <w:spacing w:before="20" w:after="20"/>
+              <w:jc w:val="left"/>
+            </w:pPr>
+            <w:r>
+              <w:rPr>
+                <w:sz w:val="18"/>
+              </w:rPr>
+              <w:t xml:space="preserve">7</w:t>
+            </w:r>
+          </w:p>
+        </w:tc>
+        <w:tc>
+          <w:tcPr/>
+          <w:p>
+            <w:pPr>
+              <w:pStyle w:val="Compact"/>
+              <w:spacing w:before="20" w:after="20"/>
               <w:jc w:val="left"/>
             </w:pPr>
             <w:hyperlink r:id="rId25">
@@ -520,7 +895,7 @@
                 <w:rPr>
                   <w:rStyle w:val="Hyperlink"/>
                 </w:rPr>
-                <w:t xml:space="preserve">Security architecture</w:t>
+                <w:t xml:space="preserve">AI and Prompt Governance</w:t>
               </w:r>
             </w:hyperlink>
           </w:p>
@@ -530,64 +905,13 @@
           <w:p>
             <w:pPr>
               <w:pStyle w:val="Compact"/>
-              <w:jc w:val="left"/>
-            </w:pPr>
-            <w:r>
-              <w:t xml:space="preserve">CISO, InfoSec, pen-testers, auditors</w:t>
-            </w:r>
-          </w:p>
-        </w:tc>
-        <w:tc>
-          <w:tcPr/>
-          <w:p>
-            <w:pPr>
-              <w:pStyle w:val="Compact"/>
-              <w:jc w:val="left"/>
-            </w:pPr>
-            <w:r>
-              <w:t xml:space="preserve">STRIDE threat model, OWASP Top 10 and ASVS L2 mapping, RBAC/ABAC, crypto and keys, known gaps</w:t>
-            </w:r>
-          </w:p>
-        </w:tc>
-      </w:tr>
-      <w:tr>
-        <w:tc>
-          <w:tcPr/>
-          <w:p>
-            <w:pPr>
-              <w:pStyle w:val="Compact"/>
-              <w:jc w:val="left"/>
-            </w:pPr>
-            <w:r>
-              <w:t xml:space="preserve">7</w:t>
-            </w:r>
-          </w:p>
-        </w:tc>
-        <w:tc>
-          <w:tcPr/>
-          <w:p>
-            <w:pPr>
-              <w:pStyle w:val="Compact"/>
-              <w:jc w:val="left"/>
-            </w:pPr>
-            <w:hyperlink r:id="rId26">
-              <w:r>
-                <w:rPr>
-                  <w:rStyle w:val="Hyperlink"/>
-                </w:rPr>
-                <w:t xml:space="preserve">AI governance</w:t>
-              </w:r>
-            </w:hyperlink>
-          </w:p>
-        </w:tc>
-        <w:tc>
-          <w:tcPr/>
-          <w:p>
-            <w:pPr>
-              <w:pStyle w:val="Compact"/>
-              <w:jc w:val="left"/>
-            </w:pPr>
-            <w:r>
+              <w:spacing w:before="20" w:after="20"/>
+              <w:jc w:val="left"/>
+            </w:pPr>
+            <w:r>
+              <w:rPr>
+                <w:sz w:val="18"/>
+              </w:rPr>
               <w:t xml:space="preserve">Compliance, model risk, CX, product</w:t>
             </w:r>
           </w:p>
@@ -597,9 +921,13 @@
           <w:p>
             <w:pPr>
               <w:pStyle w:val="Compact"/>
-              <w:jc w:val="left"/>
-            </w:pPr>
-            <w:r>
+              <w:spacing w:before="20" w:after="20"/>
+              <w:jc w:val="left"/>
+            </w:pPr>
+            <w:r>
+              <w:rPr>
+                <w:sz w:val="18"/>
+              </w:rPr>
               <w:t xml:space="preserve">Voice bot principles, script lifecycle, lead-score model risk, LLM policy, monitoring, RACI</w:t>
             </w:r>
           </w:p>
@@ -639,12 +967,14 @@
           <w:p>
             <w:pPr>
               <w:pStyle w:val="Compact"/>
+              <w:spacing w:before="20" w:after="20"/>
               <w:jc w:val="left"/>
             </w:pPr>
             <w:r>
               <w:rPr>
                 <w:b/>
                 <w:color w:val="FFFFFF"/>
+                <w:sz w:val="18"/>
               </w:rPr>
               <w:t xml:space="preserve">ADR</w:t>
             </w:r>
@@ -657,12 +987,14 @@
           <w:p>
             <w:pPr>
               <w:pStyle w:val="Compact"/>
+              <w:spacing w:before="20" w:after="20"/>
               <w:jc w:val="left"/>
             </w:pPr>
             <w:r>
               <w:rPr>
                 <w:b/>
                 <w:color w:val="FFFFFF"/>
+                <w:sz w:val="18"/>
               </w:rPr>
               <w:t xml:space="preserve">Decision</w:t>
             </w:r>
@@ -675,12 +1007,14 @@
           <w:p>
             <w:pPr>
               <w:pStyle w:val="Compact"/>
+              <w:spacing w:before="20" w:after="20"/>
               <w:jc w:val="left"/>
             </w:pPr>
             <w:r>
               <w:rPr>
                 <w:b/>
                 <w:color w:val="FFFFFF"/>
+                <w:sz w:val="18"/>
               </w:rPr>
               <w:t xml:space="preserve">Status</w:t>
             </w:r>
@@ -689,13 +1023,16 @@
       </w:tr>
       <w:tr>
         <w:tc>
-          <w:tcPr/>
-          <w:p>
-            <w:pPr>
-              <w:pStyle w:val="Compact"/>
-              <w:jc w:val="left"/>
-            </w:pPr>
-            <w:hyperlink r:id="rId27">
+          <w:tcPr>
+            <w:noWrap/>
+          </w:tcPr>
+          <w:p>
+            <w:pPr>
+              <w:pStyle w:val="Compact"/>
+              <w:spacing w:before="20" w:after="20"/>
+              <w:jc w:val="left"/>
+            </w:pPr>
+            <w:hyperlink r:id="rId26">
               <w:r>
                 <w:rPr>
                   <w:rStyle w:val="Hyperlink"/>
@@ -710,9 +1047,13 @@
           <w:p>
             <w:pPr>
               <w:pStyle w:val="Compact"/>
-              <w:jc w:val="left"/>
-            </w:pPr>
-            <w:r>
+              <w:spacing w:before="20" w:after="20"/>
+              <w:jc w:val="left"/>
+            </w:pPr>
+            <w:r>
+              <w:rPr>
+                <w:sz w:val="18"/>
+              </w:rPr>
               <w:t xml:space="preserve">Hexagonal / Clean architecture</w:t>
             </w:r>
           </w:p>
@@ -722,9 +1063,13 @@
           <w:p>
             <w:pPr>
               <w:pStyle w:val="Compact"/>
-              <w:jc w:val="left"/>
-            </w:pPr>
-            <w:r>
+              <w:spacing w:before="20" w:after="20"/>
+              <w:jc w:val="left"/>
+            </w:pPr>
+            <w:r>
+              <w:rPr>
+                <w:sz w:val="18"/>
+              </w:rPr>
               <w:t xml:space="preserve">Accepted</w:t>
             </w:r>
           </w:p>
@@ -732,13 +1077,16 @@
       </w:tr>
       <w:tr>
         <w:tc>
-          <w:tcPr/>
-          <w:p>
-            <w:pPr>
-              <w:pStyle w:val="Compact"/>
-              <w:jc w:val="left"/>
-            </w:pPr>
-            <w:hyperlink r:id="rId28">
+          <w:tcPr>
+            <w:noWrap/>
+          </w:tcPr>
+          <w:p>
+            <w:pPr>
+              <w:pStyle w:val="Compact"/>
+              <w:spacing w:before="20" w:after="20"/>
+              <w:jc w:val="left"/>
+            </w:pPr>
+            <w:hyperlink r:id="rId27">
               <w:r>
                 <w:rPr>
                   <w:rStyle w:val="Hyperlink"/>
@@ -753,21 +1101,32 @@
           <w:p>
             <w:pPr>
               <w:pStyle w:val="Compact"/>
-              <w:jc w:val="left"/>
-            </w:pPr>
-            <w:r>
+              <w:spacing w:before="20" w:after="20"/>
+              <w:jc w:val="left"/>
+            </w:pPr>
+            <w:r>
+              <w:rPr>
+                <w:sz w:val="18"/>
+              </w:rPr>
               <w:t xml:space="preserve">Node.js 22, minimal dependencies (</w:t>
             </w:r>
             <w:r>
               <w:rPr>
                 <w:rStyle w:val="VerbatimChar"/>
+                <w:sz w:val="18"/>
               </w:rPr>
               <w:t xml:space="preserve">pg</w:t>
             </w:r>
             <w:r>
+              <w:rPr>
+                <w:sz w:val="18"/>
+              </w:rPr>
               <w:t xml:space="preserve"> </w:t>
             </w:r>
             <w:r>
+              <w:rPr>
+                <w:sz w:val="18"/>
+              </w:rPr>
               <w:t xml:space="preserve">only at runtime), JavaScript + JSDoc</w:t>
             </w:r>
           </w:p>
@@ -777,9 +1136,13 @@
           <w:p>
             <w:pPr>
               <w:pStyle w:val="Compact"/>
-              <w:jc w:val="left"/>
-            </w:pPr>
-            <w:r>
+              <w:spacing w:before="20" w:after="20"/>
+              <w:jc w:val="left"/>
+            </w:pPr>
+            <w:r>
+              <w:rPr>
+                <w:sz w:val="18"/>
+              </w:rPr>
               <w:t xml:space="preserve">Accepted</w:t>
             </w:r>
           </w:p>
@@ -787,13 +1150,16 @@
       </w:tr>
       <w:tr>
         <w:tc>
-          <w:tcPr/>
-          <w:p>
-            <w:pPr>
-              <w:pStyle w:val="Compact"/>
-              <w:jc w:val="left"/>
-            </w:pPr>
-            <w:hyperlink r:id="rId29">
+          <w:tcPr>
+            <w:noWrap/>
+          </w:tcPr>
+          <w:p>
+            <w:pPr>
+              <w:pStyle w:val="Compact"/>
+              <w:spacing w:before="20" w:after="20"/>
+              <w:jc w:val="left"/>
+            </w:pPr>
+            <w:hyperlink r:id="rId28">
               <w:r>
                 <w:rPr>
                   <w:rStyle w:val="Hyperlink"/>
@@ -808,9 +1174,13 @@
           <w:p>
             <w:pPr>
               <w:pStyle w:val="Compact"/>
-              <w:jc w:val="left"/>
-            </w:pPr>
-            <w:r>
+              <w:spacing w:before="20" w:after="20"/>
+              <w:jc w:val="left"/>
+            </w:pPr>
+            <w:r>
+              <w:rPr>
+                <w:sz w:val="18"/>
+              </w:rPr>
               <w:t xml:space="preserve">JSON Logic rules engine with maker-checker governance</w:t>
             </w:r>
           </w:p>
@@ -820,9 +1190,13 @@
           <w:p>
             <w:pPr>
               <w:pStyle w:val="Compact"/>
-              <w:jc w:val="left"/>
-            </w:pPr>
-            <w:r>
+              <w:spacing w:before="20" w:after="20"/>
+              <w:jc w:val="left"/>
+            </w:pPr>
+            <w:r>
+              <w:rPr>
+                <w:sz w:val="18"/>
+              </w:rPr>
               <w:t xml:space="preserve">Accepted</w:t>
             </w:r>
           </w:p>
@@ -830,13 +1204,16 @@
       </w:tr>
       <w:tr>
         <w:tc>
-          <w:tcPr/>
-          <w:p>
-            <w:pPr>
-              <w:pStyle w:val="Compact"/>
-              <w:jc w:val="left"/>
-            </w:pPr>
-            <w:hyperlink r:id="rId30">
+          <w:tcPr>
+            <w:noWrap/>
+          </w:tcPr>
+          <w:p>
+            <w:pPr>
+              <w:pStyle w:val="Compact"/>
+              <w:spacing w:before="20" w:after="20"/>
+              <w:jc w:val="left"/>
+            </w:pPr>
+            <w:hyperlink r:id="rId29">
               <w:r>
                 <w:rPr>
                   <w:rStyle w:val="Hyperlink"/>
@@ -851,9 +1228,13 @@
           <w:p>
             <w:pPr>
               <w:pStyle w:val="Compact"/>
-              <w:jc w:val="left"/>
-            </w:pPr>
-            <w:r>
+              <w:spacing w:before="20" w:after="20"/>
+              <w:jc w:val="left"/>
+            </w:pPr>
+            <w:r>
+              <w:rPr>
+                <w:sz w:val="18"/>
+              </w:rPr>
               <w:t xml:space="preserve">PostgreSQL document + indexed-columns pattern; in-memory adapter with the same behaviour</w:t>
             </w:r>
           </w:p>
@@ -863,9 +1244,13 @@
           <w:p>
             <w:pPr>
               <w:pStyle w:val="Compact"/>
-              <w:jc w:val="left"/>
-            </w:pPr>
-            <w:r>
+              <w:spacing w:before="20" w:after="20"/>
+              <w:jc w:val="left"/>
+            </w:pPr>
+            <w:r>
+              <w:rPr>
+                <w:sz w:val="18"/>
+              </w:rPr>
               <w:t xml:space="preserve">Accepted</w:t>
             </w:r>
           </w:p>
@@ -873,13 +1258,16 @@
       </w:tr>
       <w:tr>
         <w:tc>
-          <w:tcPr/>
-          <w:p>
-            <w:pPr>
-              <w:pStyle w:val="Compact"/>
-              <w:jc w:val="left"/>
-            </w:pPr>
-            <w:hyperlink r:id="rId31">
+          <w:tcPr>
+            <w:noWrap/>
+          </w:tcPr>
+          <w:p>
+            <w:pPr>
+              <w:pStyle w:val="Compact"/>
+              <w:spacing w:before="20" w:after="20"/>
+              <w:jc w:val="left"/>
+            </w:pPr>
+            <w:hyperlink r:id="rId30">
               <w:r>
                 <w:rPr>
                   <w:rStyle w:val="Hyperlink"/>
@@ -894,24 +1282,38 @@
           <w:p>
             <w:pPr>
               <w:pStyle w:val="Compact"/>
-              <w:jc w:val="left"/>
-            </w:pPr>
-            <w:r>
+              <w:spacing w:before="20" w:after="20"/>
+              <w:jc w:val="left"/>
+            </w:pPr>
+            <w:r>
+              <w:rPr>
+                <w:sz w:val="18"/>
+              </w:rPr>
               <w:t xml:space="preserve">Outbox table +</w:t>
             </w:r>
             <w:r>
+              <w:rPr>
+                <w:sz w:val="18"/>
+              </w:rPr>
               <w:t xml:space="preserve"> </w:t>
             </w:r>
             <w:r>
               <w:rPr>
                 <w:rStyle w:val="VerbatimChar"/>
+                <w:sz w:val="18"/>
               </w:rPr>
               <w:t xml:space="preserve">SKIP LOCKED</w:t>
             </w:r>
             <w:r>
+              <w:rPr>
+                <w:sz w:val="18"/>
+              </w:rPr>
               <w:t xml:space="preserve"> </w:t>
             </w:r>
             <w:r>
+              <w:rPr>
+                <w:sz w:val="18"/>
+              </w:rPr>
               <w:t xml:space="preserve">relay now, message broker later</w:t>
             </w:r>
           </w:p>
@@ -921,23 +1323,30 @@
           <w:p>
             <w:pPr>
               <w:pStyle w:val="Compact"/>
-              <w:jc w:val="left"/>
-            </w:pPr>
-            <w:r>
-              <w:t xml:space="preserve">Accepted (gap noted)</w:t>
+              <w:spacing w:before="20" w:after="20"/>
+              <w:jc w:val="left"/>
+            </w:pPr>
+            <w:r>
+              <w:rPr>
+                <w:sz w:val="18"/>
+              </w:rPr>
+              <w:t xml:space="preserve">Accepted (gaps noted)</w:t>
             </w:r>
           </w:p>
         </w:tc>
       </w:tr>
       <w:tr>
         <w:tc>
-          <w:tcPr/>
-          <w:p>
-            <w:pPr>
-              <w:pStyle w:val="Compact"/>
-              <w:jc w:val="left"/>
-            </w:pPr>
-            <w:hyperlink r:id="rId32">
+          <w:tcPr>
+            <w:noWrap/>
+          </w:tcPr>
+          <w:p>
+            <w:pPr>
+              <w:pStyle w:val="Compact"/>
+              <w:spacing w:before="20" w:after="20"/>
+              <w:jc w:val="left"/>
+            </w:pPr>
+            <w:hyperlink r:id="rId31">
               <w:r>
                 <w:rPr>
                   <w:rStyle w:val="Hyperlink"/>
@@ -952,9 +1361,13 @@
           <w:p>
             <w:pPr>
               <w:pStyle w:val="Compact"/>
-              <w:jc w:val="left"/>
-            </w:pPr>
-            <w:r>
+              <w:spacing w:before="20" w:after="20"/>
+              <w:jc w:val="left"/>
+            </w:pPr>
+            <w:r>
+              <w:rPr>
+                <w:sz w:val="18"/>
+              </w:rPr>
               <w:t xml:space="preserve">Field-level AES-256-GCM encryption + HMAC blind index</w:t>
             </w:r>
           </w:p>
@@ -964,9 +1377,13 @@
           <w:p>
             <w:pPr>
               <w:pStyle w:val="Compact"/>
-              <w:jc w:val="left"/>
-            </w:pPr>
-            <w:r>
+              <w:spacing w:before="20" w:after="20"/>
+              <w:jc w:val="left"/>
+            </w:pPr>
+            <w:r>
+              <w:rPr>
+                <w:sz w:val="18"/>
+              </w:rPr>
               <w:t xml:space="preserve">Accepted</w:t>
             </w:r>
           </w:p>
@@ -974,13 +1391,16 @@
       </w:tr>
       <w:tr>
         <w:tc>
-          <w:tcPr/>
-          <w:p>
-            <w:pPr>
-              <w:pStyle w:val="Compact"/>
-              <w:jc w:val="left"/>
-            </w:pPr>
-            <w:hyperlink r:id="rId33">
+          <w:tcPr>
+            <w:noWrap/>
+          </w:tcPr>
+          <w:p>
+            <w:pPr>
+              <w:pStyle w:val="Compact"/>
+              <w:spacing w:before="20" w:after="20"/>
+              <w:jc w:val="left"/>
+            </w:pPr>
+            <w:hyperlink r:id="rId32">
               <w:r>
                 <w:rPr>
                   <w:rStyle w:val="Hyperlink"/>
@@ -995,21 +1415,29 @@
           <w:p>
             <w:pPr>
               <w:pStyle w:val="Compact"/>
-              <w:jc w:val="left"/>
-            </w:pPr>
-            <w:r>
-              <w:t xml:space="preserve">Local JWT + TOTP now; OIDC federation to TASCO IdP as target</w:t>
-            </w:r>
-          </w:p>
-        </w:tc>
-        <w:tc>
-          <w:tcPr/>
-          <w:p>
-            <w:pPr>
-              <w:pStyle w:val="Compact"/>
-              <w:jc w:val="left"/>
-            </w:pPr>
-            <w:r>
+              <w:spacing w:before="20" w:after="20"/>
+              <w:jc w:val="left"/>
+            </w:pPr>
+            <w:r>
+              <w:rPr>
+                <w:sz w:val="18"/>
+              </w:rPr>
+              <w:t xml:space="preserve">Local JWT + TOTP (self-enrolment, replay protection) now; OIDC federation to the TASCO IdP as target</w:t>
+            </w:r>
+          </w:p>
+        </w:tc>
+        <w:tc>
+          <w:tcPr/>
+          <w:p>
+            <w:pPr>
+              <w:pStyle w:val="Compact"/>
+              <w:spacing w:before="20" w:after="20"/>
+              <w:jc w:val="left"/>
+            </w:pPr>
+            <w:r>
+              <w:rPr>
+                <w:sz w:val="18"/>
+              </w:rPr>
               <w:t xml:space="preserve">Accepted (interim)</w:t>
             </w:r>
           </w:p>
@@ -1017,13 +1445,16 @@
       </w:tr>
       <w:tr>
         <w:tc>
-          <w:tcPr/>
-          <w:p>
-            <w:pPr>
-              <w:pStyle w:val="Compact"/>
-              <w:jc w:val="left"/>
-            </w:pPr>
-            <w:hyperlink r:id="rId34">
+          <w:tcPr>
+            <w:noWrap/>
+          </w:tcPr>
+          <w:p>
+            <w:pPr>
+              <w:pStyle w:val="Compact"/>
+              <w:spacing w:before="20" w:after="20"/>
+              <w:jc w:val="left"/>
+            </w:pPr>
+            <w:hyperlink r:id="rId33">
               <w:r>
                 <w:rPr>
                   <w:rStyle w:val="Hyperlink"/>
@@ -1038,9 +1469,13 @@
           <w:p>
             <w:pPr>
               <w:pStyle w:val="Compact"/>
-              <w:jc w:val="left"/>
-            </w:pPr>
-            <w:r>
+              <w:spacing w:before="20" w:after="20"/>
+              <w:jc w:val="left"/>
+            </w:pPr>
+            <w:r>
+              <w:rPr>
+                <w:sz w:val="18"/>
+              </w:rPr>
               <w:t xml:space="preserve">Hash-chained, append-only audit log</w:t>
             </w:r>
           </w:p>
@@ -1050,9 +1485,13 @@
           <w:p>
             <w:pPr>
               <w:pStyle w:val="Compact"/>
-              <w:jc w:val="left"/>
-            </w:pPr>
-            <w:r>
+              <w:spacing w:before="20" w:after="20"/>
+              <w:jc w:val="left"/>
+            </w:pPr>
+            <w:r>
+              <w:rPr>
+                <w:sz w:val="18"/>
+              </w:rPr>
               <w:t xml:space="preserve">Accepted</w:t>
             </w:r>
           </w:p>
@@ -1060,13 +1499,16 @@
       </w:tr>
       <w:tr>
         <w:tc>
-          <w:tcPr/>
-          <w:p>
-            <w:pPr>
-              <w:pStyle w:val="Compact"/>
-              <w:jc w:val="left"/>
-            </w:pPr>
-            <w:hyperlink r:id="rId35">
+          <w:tcPr>
+            <w:noWrap/>
+          </w:tcPr>
+          <w:p>
+            <w:pPr>
+              <w:pStyle w:val="Compact"/>
+              <w:spacing w:before="20" w:after="20"/>
+              <w:jc w:val="left"/>
+            </w:pPr>
+            <w:hyperlink r:id="rId34">
               <w:r>
                 <w:rPr>
                   <w:rStyle w:val="Hyperlink"/>
@@ -1081,9 +1523,13 @@
           <w:p>
             <w:pPr>
               <w:pStyle w:val="Compact"/>
-              <w:jc w:val="left"/>
-            </w:pPr>
-            <w:r>
+              <w:spacing w:before="20" w:after="20"/>
+              <w:jc w:val="left"/>
+            </w:pPr>
+            <w:r>
+              <w:rPr>
+                <w:sz w:val="18"/>
+              </w:rPr>
               <w:t xml:space="preserve">Deterministic voice bot dialogue with a governed script; LLM only as an optional classifier behind a port</w:t>
             </w:r>
           </w:p>
@@ -1093,9 +1539,13 @@
           <w:p>
             <w:pPr>
               <w:pStyle w:val="Compact"/>
-              <w:jc w:val="left"/>
-            </w:pPr>
-            <w:r>
+              <w:spacing w:before="20" w:after="20"/>
+              <w:jc w:val="left"/>
+            </w:pPr>
+            <w:r>
+              <w:rPr>
+                <w:sz w:val="18"/>
+              </w:rPr>
               <w:t xml:space="preserve">Accepted</w:t>
             </w:r>
           </w:p>
@@ -1103,13 +1553,16 @@
       </w:tr>
       <w:tr>
         <w:tc>
-          <w:tcPr/>
-          <w:p>
-            <w:pPr>
-              <w:pStyle w:val="Compact"/>
-              <w:jc w:val="left"/>
-            </w:pPr>
-            <w:hyperlink r:id="rId36">
+          <w:tcPr>
+            <w:noWrap/>
+          </w:tcPr>
+          <w:p>
+            <w:pPr>
+              <w:pStyle w:val="Compact"/>
+              <w:spacing w:before="20" w:after="20"/>
+              <w:jc w:val="left"/>
+            </w:pPr>
+            <w:hyperlink r:id="rId35">
               <w:r>
                 <w:rPr>
                   <w:rStyle w:val="Hyperlink"/>
@@ -1124,9 +1577,13 @@
           <w:p>
             <w:pPr>
               <w:pStyle w:val="Compact"/>
-              <w:jc w:val="left"/>
-            </w:pPr>
-            <w:r>
+              <w:spacing w:before="20" w:after="20"/>
+              <w:jc w:val="left"/>
+            </w:pPr>
+            <w:r>
+              <w:rPr>
+                <w:sz w:val="18"/>
+              </w:rPr>
               <w:t xml:space="preserve">API-first route table that generates OpenAPI</w:t>
             </w:r>
           </w:p>
@@ -1136,9 +1593,13 @@
           <w:p>
             <w:pPr>
               <w:pStyle w:val="Compact"/>
-              <w:jc w:val="left"/>
-            </w:pPr>
-            <w:r>
+              <w:spacing w:before="20" w:after="20"/>
+              <w:jc w:val="left"/>
+            </w:pPr>
+            <w:r>
+              <w:rPr>
+                <w:sz w:val="18"/>
+              </w:rPr>
               <w:t xml:space="preserve">Accepted</w:t>
             </w:r>
           </w:p>
@@ -1146,13 +1607,16 @@
       </w:tr>
       <w:tr>
         <w:tc>
-          <w:tcPr/>
-          <w:p>
-            <w:pPr>
-              <w:pStyle w:val="Compact"/>
-              <w:jc w:val="left"/>
-            </w:pPr>
-            <w:hyperlink r:id="rId37">
+          <w:tcPr>
+            <w:noWrap/>
+          </w:tcPr>
+          <w:p>
+            <w:pPr>
+              <w:pStyle w:val="Compact"/>
+              <w:spacing w:before="20" w:after="20"/>
+              <w:jc w:val="left"/>
+            </w:pPr>
+            <w:hyperlink r:id="rId36">
               <w:r>
                 <w:rPr>
                   <w:rStyle w:val="Hyperlink"/>
@@ -1167,9 +1631,13 @@
           <w:p>
             <w:pPr>
               <w:pStyle w:val="Compact"/>
-              <w:jc w:val="left"/>
-            </w:pPr>
-            <w:r>
+              <w:spacing w:before="20" w:after="20"/>
+              <w:jc w:val="left"/>
+            </w:pPr>
+            <w:r>
+              <w:rPr>
+                <w:sz w:val="18"/>
+              </w:rPr>
               <w:t xml:space="preserve">Vanilla JS SPA + design tokens (no framework, strict CSP)</w:t>
             </w:r>
           </w:p>
@@ -1179,9 +1647,13 @@
           <w:p>
             <w:pPr>
               <w:pStyle w:val="Compact"/>
-              <w:jc w:val="left"/>
-            </w:pPr>
-            <w:r>
+              <w:spacing w:before="20" w:after="20"/>
+              <w:jc w:val="left"/>
+            </w:pPr>
+            <w:r>
+              <w:rPr>
+                <w:sz w:val="18"/>
+              </w:rPr>
               <w:t xml:space="preserve">Accepted</w:t>
             </w:r>
           </w:p>
@@ -1189,13 +1661,16 @@
       </w:tr>
       <w:tr>
         <w:tc>
-          <w:tcPr/>
-          <w:p>
-            <w:pPr>
-              <w:pStyle w:val="Compact"/>
-              <w:jc w:val="left"/>
-            </w:pPr>
-            <w:hyperlink r:id="rId38">
+          <w:tcPr>
+            <w:noWrap/>
+          </w:tcPr>
+          <w:p>
+            <w:pPr>
+              <w:pStyle w:val="Compact"/>
+              <w:spacing w:before="20" w:after="20"/>
+              <w:jc w:val="left"/>
+            </w:pPr>
+            <w:hyperlink r:id="rId37">
               <w:r>
                 <w:rPr>
                   <w:rStyle w:val="Hyperlink"/>
@@ -1210,21 +1685,83 @@
           <w:p>
             <w:pPr>
               <w:pStyle w:val="Compact"/>
-              <w:jc w:val="left"/>
-            </w:pPr>
-            <w:r>
-              <w:t xml:space="preserve">Containers; Kubernetes as primary target; Railway for pilots</w:t>
-            </w:r>
-          </w:p>
-        </w:tc>
-        <w:tc>
-          <w:tcPr/>
-          <w:p>
-            <w:pPr>
-              <w:pStyle w:val="Compact"/>
-              <w:jc w:val="left"/>
-            </w:pPr>
-            <w:r>
+              <w:spacing w:before="20" w:after="20"/>
+              <w:jc w:val="left"/>
+            </w:pPr>
+            <w:r>
+              <w:rPr>
+                <w:sz w:val="18"/>
+              </w:rPr>
+              <w:t xml:space="preserve">Containers; Kubernetes as primary target; Railway for pilots and UAT</w:t>
+            </w:r>
+          </w:p>
+        </w:tc>
+        <w:tc>
+          <w:tcPr/>
+          <w:p>
+            <w:pPr>
+              <w:pStyle w:val="Compact"/>
+              <w:spacing w:before="20" w:after="20"/>
+              <w:jc w:val="left"/>
+            </w:pPr>
+            <w:r>
+              <w:rPr>
+                <w:sz w:val="18"/>
+              </w:rPr>
+              <w:t xml:space="preserve">Accepted</w:t>
+            </w:r>
+          </w:p>
+        </w:tc>
+      </w:tr>
+      <w:tr>
+        <w:tc>
+          <w:tcPr>
+            <w:noWrap/>
+          </w:tcPr>
+          <w:p>
+            <w:pPr>
+              <w:pStyle w:val="Compact"/>
+              <w:spacing w:before="20" w:after="20"/>
+              <w:jc w:val="left"/>
+            </w:pPr>
+            <w:hyperlink r:id="rId38">
+              <w:r>
+                <w:rPr>
+                  <w:rStyle w:val="Hyperlink"/>
+                </w:rPr>
+                <w:t xml:space="preserve">ADR-013</w:t>
+              </w:r>
+            </w:hyperlink>
+          </w:p>
+        </w:tc>
+        <w:tc>
+          <w:tcPr/>
+          <w:p>
+            <w:pPr>
+              <w:pStyle w:val="Compact"/>
+              <w:spacing w:before="20" w:after="20"/>
+              <w:jc w:val="left"/>
+            </w:pPr>
+            <w:r>
+              <w:rPr>
+                <w:sz w:val="18"/>
+              </w:rPr>
+              <w:t xml:space="preserve">TASCO core as the master for products and rating; CoreRating and ProductCatalogue ports</w:t>
+            </w:r>
+          </w:p>
+        </w:tc>
+        <w:tc>
+          <w:tcPr/>
+          <w:p>
+            <w:pPr>
+              <w:pStyle w:val="Compact"/>
+              <w:spacing w:before="20" w:after="20"/>
+              <w:jc w:val="left"/>
+            </w:pPr>
+            <w:r>
+              <w:rPr>
+                <w:sz w:val="18"/>
+              </w:rPr>
               <w:t xml:space="preserve">Accepted</w:t>
             </w:r>
           </w:p>
@@ -1247,9 +1784,17 @@
         <w:pStyle w:val="FirstParagraph"/>
       </w:pPr>
       <w:r>
+        <w:t xml:space="preserve">The diagram shows the four channels, the layers inside the platform and the external systems reached through ports.</w:t>
+      </w:r>
+    </w:p>
+    <w:p>
+      <w:pPr>
+        <w:pStyle w:val="BodyText"/>
+      </w:pPr>
+      <w:r>
         <w:drawing>
           <wp:inline>
-            <wp:extent cx="6119999" cy="3453428"/>
+            <wp:extent cx="6119999" cy="3545228"/>
             <wp:effectExtent b="0" l="0" r="0" t="0"/>
             <wp:docPr descr="" title="" id="42" name="Picture"/>
             <a:graphic>
@@ -1270,7 +1815,7 @@
                   <pic:spPr bwMode="auto">
                     <a:xfrm>
                       <a:off x="0" y="0"/>
-                      <a:ext cx="6119999" cy="3453428"/>
+                      <a:ext cx="6119999" cy="3545228"/>
                     </a:xfrm>
                     <a:prstGeom prst="rect">
                       <a:avLst/>
@@ -1323,12 +1868,14 @@
           <w:p>
             <w:pPr>
               <w:pStyle w:val="Compact"/>
+              <w:spacing w:before="20" w:after="20"/>
               <w:jc w:val="left"/>
             </w:pPr>
             <w:r>
               <w:rPr>
                 <w:b/>
                 <w:color w:val="FFFFFF"/>
+                <w:sz w:val="18"/>
               </w:rPr>
               <w:t xml:space="preserve">Layer</w:t>
             </w:r>
@@ -1341,12 +1888,14 @@
           <w:p>
             <w:pPr>
               <w:pStyle w:val="Compact"/>
+              <w:spacing w:before="20" w:after="20"/>
               <w:jc w:val="left"/>
             </w:pPr>
             <w:r>
               <w:rPr>
                 <w:b/>
                 <w:color w:val="FFFFFF"/>
+                <w:sz w:val="18"/>
               </w:rPr>
               <w:t xml:space="preserve">Path</w:t>
             </w:r>
@@ -1359,12 +1908,14 @@
           <w:p>
             <w:pPr>
               <w:pStyle w:val="Compact"/>
+              <w:spacing w:before="20" w:after="20"/>
               <w:jc w:val="left"/>
             </w:pPr>
             <w:r>
               <w:rPr>
                 <w:b/>
                 <w:color w:val="FFFFFF"/>
+                <w:sz w:val="18"/>
               </w:rPr>
               <w:t xml:space="preserve">Contents</w:t>
             </w:r>
@@ -1377,9 +1928,13 @@
           <w:p>
             <w:pPr>
               <w:pStyle w:val="Compact"/>
-              <w:jc w:val="left"/>
-            </w:pPr>
-            <w:r>
+              <w:spacing w:before="20" w:after="20"/>
+              <w:jc w:val="left"/>
+            </w:pPr>
+            <w:r>
+              <w:rPr>
+                <w:sz w:val="18"/>
+              </w:rPr>
               <w:t xml:space="preserve">Shared kernel</w:t>
             </w:r>
           </w:p>
@@ -1389,11 +1944,13 @@
           <w:p>
             <w:pPr>
               <w:pStyle w:val="Compact"/>
-              <w:jc w:val="left"/>
-            </w:pPr>
-            <w:r>
-              <w:rPr>
-                <w:rStyle w:val="VerbatimChar"/>
+              <w:spacing w:before="20" w:after="20"/>
+              <w:jc w:val="left"/>
+            </w:pPr>
+            <w:r>
+              <w:rPr>
+                <w:rStyle w:val="VerbatimChar"/>
+                <w:sz w:val="18"/>
               </w:rPr>
               <w:t xml:space="preserve">src/shared/</w:t>
             </w:r>
@@ -1404,24 +1961,38 @@
           <w:p>
             <w:pPr>
               <w:pStyle w:val="Compact"/>
-              <w:jc w:val="left"/>
-            </w:pPr>
-            <w:r>
-              <w:t xml:space="preserve">config (12-factor,</w:t>
-            </w:r>
-            <w:r>
+              <w:spacing w:before="20" w:after="20"/>
+              <w:jc w:val="left"/>
+            </w:pPr>
+            <w:r>
+              <w:rPr>
+                <w:sz w:val="18"/>
+              </w:rPr>
+              <w:t xml:space="preserve">Config (12-factor,</w:t>
+            </w:r>
+            <w:r>
+              <w:rPr>
+                <w:sz w:val="18"/>
+              </w:rPr>
               <w:t xml:space="preserve"> </w:t>
             </w:r>
             <w:r>
               <w:rPr>
                 <w:rStyle w:val="VerbatimChar"/>
+                <w:sz w:val="18"/>
               </w:rPr>
               <w:t xml:space="preserve">*_FILE</w:t>
             </w:r>
             <w:r>
+              <w:rPr>
+                <w:sz w:val="18"/>
+              </w:rPr>
               <w:t xml:space="preserve"> </w:t>
             </w:r>
             <w:r>
+              <w:rPr>
+                <w:sz w:val="18"/>
+              </w:rPr>
               <w:t xml:space="preserve">secrets), logger (PII redaction), crypto, validation, resilience, metrics, errors, clock</w:t>
             </w:r>
           </w:p>
@@ -1433,9 +2004,13 @@
           <w:p>
             <w:pPr>
               <w:pStyle w:val="Compact"/>
-              <w:jc w:val="left"/>
-            </w:pPr>
-            <w:r>
+              <w:spacing w:before="20" w:after="20"/>
+              <w:jc w:val="left"/>
+            </w:pPr>
+            <w:r>
+              <w:rPr>
+                <w:sz w:val="18"/>
+              </w:rPr>
               <w:t xml:space="preserve">Rules engine</w:t>
             </w:r>
           </w:p>
@@ -1445,11 +2020,13 @@
           <w:p>
             <w:pPr>
               <w:pStyle w:val="Compact"/>
-              <w:jc w:val="left"/>
-            </w:pPr>
-            <w:r>
-              <w:rPr>
-                <w:rStyle w:val="VerbatimChar"/>
+              <w:spacing w:before="20" w:after="20"/>
+              <w:jc w:val="left"/>
+            </w:pPr>
+            <w:r>
+              <w:rPr>
+                <w:rStyle w:val="VerbatimChar"/>
+                <w:sz w:val="18"/>
               </w:rPr>
               <w:t xml:space="preserve">src/rules/</w:t>
             </w:r>
@@ -1460,45 +2037,70 @@
           <w:p>
             <w:pPr>
               <w:pStyle w:val="Compact"/>
-              <w:jc w:val="left"/>
-            </w:pPr>
-            <w:r>
-              <w:rPr>
-                <w:rStyle w:val="VerbatimChar"/>
+              <w:spacing w:before="20" w:after="20"/>
+              <w:jc w:val="left"/>
+            </w:pPr>
+            <w:r>
+              <w:rPr>
+                <w:rStyle w:val="VerbatimChar"/>
+                <w:sz w:val="18"/>
               </w:rPr>
               <w:t xml:space="preserve">jsonLogic.js</w:t>
             </w:r>
             <w:r>
+              <w:rPr>
+                <w:sz w:val="18"/>
+              </w:rPr>
               <w:t xml:space="preserve"> </w:t>
             </w:r>
             <w:r>
+              <w:rPr>
+                <w:sz w:val="18"/>
+              </w:rPr>
               <w:t xml:space="preserve">(safe subset),</w:t>
             </w:r>
             <w:r>
+              <w:rPr>
+                <w:sz w:val="18"/>
+              </w:rPr>
               <w:t xml:space="preserve"> </w:t>
             </w:r>
             <w:r>
               <w:rPr>
                 <w:rStyle w:val="VerbatimChar"/>
+                <w:sz w:val="18"/>
               </w:rPr>
               <w:t xml:space="preserve">decisionTable.js</w:t>
             </w:r>
             <w:r>
+              <w:rPr>
+                <w:sz w:val="18"/>
+              </w:rPr>
               <w:t xml:space="preserve">,</w:t>
             </w:r>
             <w:r>
+              <w:rPr>
+                <w:sz w:val="18"/>
+              </w:rPr>
               <w:t xml:space="preserve"> </w:t>
             </w:r>
             <w:r>
               <w:rPr>
                 <w:rStyle w:val="VerbatimChar"/>
+                <w:sz w:val="18"/>
               </w:rPr>
               <w:t xml:space="preserve">validators.js</w:t>
             </w:r>
             <w:r>
+              <w:rPr>
+                <w:sz w:val="18"/>
+              </w:rPr>
               <w:t xml:space="preserve"> </w:t>
             </w:r>
             <w:r>
+              <w:rPr>
+                <w:sz w:val="18"/>
+              </w:rPr>
               <w:t xml:space="preserve">(per-kind validation, copy guard, statutory commission caps)</w:t>
             </w:r>
           </w:p>
@@ -1506,13 +2108,19 @@
       </w:tr>
       <w:tr>
         <w:tc>
-          <w:tcPr/>
-          <w:p>
-            <w:pPr>
-              <w:pStyle w:val="Compact"/>
-              <w:jc w:val="left"/>
-            </w:pPr>
-            <w:r>
+          <w:tcPr>
+            <w:noWrap/>
+          </w:tcPr>
+          <w:p>
+            <w:pPr>
+              <w:pStyle w:val="Compact"/>
+              <w:spacing w:before="20" w:after="20"/>
+              <w:jc w:val="left"/>
+            </w:pPr>
+            <w:r>
+              <w:rPr>
+                <w:sz w:val="18"/>
+              </w:rPr>
               <w:t xml:space="preserve">Domain</w:t>
             </w:r>
           </w:p>
@@ -1522,11 +2130,13 @@
           <w:p>
             <w:pPr>
               <w:pStyle w:val="Compact"/>
-              <w:jc w:val="left"/>
-            </w:pPr>
-            <w:r>
-              <w:rPr>
-                <w:rStyle w:val="VerbatimChar"/>
+              <w:spacing w:before="20" w:after="20"/>
+              <w:jc w:val="left"/>
+            </w:pPr>
+            <w:r>
+              <w:rPr>
+                <w:rStyle w:val="VerbatimChar"/>
+                <w:sz w:val="18"/>
               </w:rPr>
               <w:t xml:space="preserve">src/domain/</w:t>
             </w:r>
@@ -1537,71 +2147,108 @@
           <w:p>
             <w:pPr>
               <w:pStyle w:val="Compact"/>
-              <w:jc w:val="left"/>
-            </w:pPr>
-            <w:r>
-              <w:rPr>
-                <w:rStyle w:val="VerbatimChar"/>
+              <w:spacing w:before="20" w:after="20"/>
+              <w:jc w:val="left"/>
+            </w:pPr>
+            <w:r>
+              <w:rPr>
+                <w:rStyle w:val="VerbatimChar"/>
+                <w:sz w:val="18"/>
               </w:rPr>
               <w:t xml:space="preserve">identity.js</w:t>
             </w:r>
             <w:r>
+              <w:rPr>
+                <w:sz w:val="18"/>
+              </w:rPr>
               <w:t xml:space="preserve">,</w:t>
             </w:r>
             <w:r>
+              <w:rPr>
+                <w:sz w:val="18"/>
+              </w:rPr>
               <w:t xml:space="preserve"> </w:t>
             </w:r>
             <w:r>
               <w:rPr>
                 <w:rStyle w:val="VerbatimChar"/>
+                <w:sz w:val="18"/>
               </w:rPr>
               <w:t xml:space="preserve">enrichment.js</w:t>
             </w:r>
             <w:r>
+              <w:rPr>
+                <w:sz w:val="18"/>
+              </w:rPr>
               <w:t xml:space="preserve">,</w:t>
             </w:r>
             <w:r>
+              <w:rPr>
+                <w:sz w:val="18"/>
+              </w:rPr>
               <w:t xml:space="preserve"> </w:t>
             </w:r>
             <w:r>
               <w:rPr>
                 <w:rStyle w:val="VerbatimChar"/>
+                <w:sz w:val="18"/>
               </w:rPr>
               <w:t xml:space="preserve">leads.js</w:t>
             </w:r>
             <w:r>
+              <w:rPr>
+                <w:sz w:val="18"/>
+              </w:rPr>
               <w:t xml:space="preserve">,</w:t>
             </w:r>
             <w:r>
+              <w:rPr>
+                <w:sz w:val="18"/>
+              </w:rPr>
               <w:t xml:space="preserve"> </w:t>
             </w:r>
             <w:r>
               <w:rPr>
                 <w:rStyle w:val="VerbatimChar"/>
+                <w:sz w:val="18"/>
               </w:rPr>
               <w:t xml:space="preserve">rating.js</w:t>
             </w:r>
             <w:r>
+              <w:rPr>
+                <w:sz w:val="18"/>
+              </w:rPr>
               <w:t xml:space="preserve">,</w:t>
             </w:r>
             <w:r>
+              <w:rPr>
+                <w:sz w:val="18"/>
+              </w:rPr>
               <w:t xml:space="preserve"> </w:t>
             </w:r>
             <w:r>
               <w:rPr>
                 <w:rStyle w:val="VerbatimChar"/>
+                <w:sz w:val="18"/>
               </w:rPr>
               <w:t xml:space="preserve">contactPolicy.js</w:t>
             </w:r>
             <w:r>
+              <w:rPr>
+                <w:sz w:val="18"/>
+              </w:rPr>
               <w:t xml:space="preserve">,</w:t>
             </w:r>
             <w:r>
+              <w:rPr>
+                <w:sz w:val="18"/>
+              </w:rPr>
               <w:t xml:space="preserve"> </w:t>
             </w:r>
             <w:r>
               <w:rPr>
                 <w:rStyle w:val="VerbatimChar"/>
+                <w:sz w:val="18"/>
               </w:rPr>
               <w:t xml:space="preserve">voicebot.js</w:t>
             </w:r>
@@ -1610,13 +2257,19 @@
       </w:tr>
       <w:tr>
         <w:tc>
-          <w:tcPr/>
-          <w:p>
-            <w:pPr>
-              <w:pStyle w:val="Compact"/>
-              <w:jc w:val="left"/>
-            </w:pPr>
-            <w:r>
+          <w:tcPr>
+            <w:noWrap/>
+          </w:tcPr>
+          <w:p>
+            <w:pPr>
+              <w:pStyle w:val="Compact"/>
+              <w:spacing w:before="20" w:after="20"/>
+              <w:jc w:val="left"/>
+            </w:pPr>
+            <w:r>
+              <w:rPr>
+                <w:sz w:val="18"/>
+              </w:rPr>
               <w:t xml:space="preserve">Application</w:t>
             </w:r>
           </w:p>
@@ -1626,11 +2279,13 @@
           <w:p>
             <w:pPr>
               <w:pStyle w:val="Compact"/>
-              <w:jc w:val="left"/>
-            </w:pPr>
-            <w:r>
-              <w:rPr>
-                <w:rStyle w:val="VerbatimChar"/>
+              <w:spacing w:before="20" w:after="20"/>
+              <w:jc w:val="left"/>
+            </w:pPr>
+            <w:r>
+              <w:rPr>
+                <w:rStyle w:val="VerbatimChar"/>
+                <w:sz w:val="18"/>
               </w:rPr>
               <w:t xml:space="preserve">src/application/</w:t>
             </w:r>
@@ -1641,39 +2296,63 @@
           <w:p>
             <w:pPr>
               <w:pStyle w:val="Compact"/>
-              <w:jc w:val="left"/>
-            </w:pPr>
-            <w:r>
+              <w:spacing w:before="20" w:after="20"/>
+              <w:jc w:val="left"/>
+            </w:pPr>
+            <w:r>
+              <w:rPr>
+                <w:sz w:val="18"/>
+              </w:rPr>
               <w:t xml:space="preserve">One service per use-case area, plus</w:t>
             </w:r>
             <w:r>
+              <w:rPr>
+                <w:sz w:val="18"/>
+              </w:rPr>
               <w:t xml:space="preserve"> </w:t>
             </w:r>
             <w:r>
               <w:rPr>
                 <w:rStyle w:val="VerbatimChar"/>
+                <w:sz w:val="18"/>
               </w:rPr>
               <w:t xml:space="preserve">accessPolicy.js</w:t>
             </w:r>
             <w:r>
+              <w:rPr>
+                <w:sz w:val="18"/>
+              </w:rPr>
               <w:t xml:space="preserve"> </w:t>
             </w:r>
             <w:r>
+              <w:rPr>
+                <w:sz w:val="18"/>
+              </w:rPr>
               <w:t xml:space="preserve">(RBAC + ABAC + masking) and</w:t>
             </w:r>
             <w:r>
+              <w:rPr>
+                <w:sz w:val="18"/>
+              </w:rPr>
               <w:t xml:space="preserve"> </w:t>
             </w:r>
             <w:r>
               <w:rPr>
                 <w:rStyle w:val="VerbatimChar"/>
+                <w:sz w:val="18"/>
               </w:rPr>
               <w:t xml:space="preserve">rulesService.js</w:t>
             </w:r>
             <w:r>
+              <w:rPr>
+                <w:sz w:val="18"/>
+              </w:rPr>
               <w:t xml:space="preserve"> </w:t>
             </w:r>
             <w:r>
+              <w:rPr>
+                <w:sz w:val="18"/>
+              </w:rPr>
               <w:t xml:space="preserve">(versioning, maker-checker)</w:t>
             </w:r>
           </w:p>
@@ -1685,9 +2364,13 @@
           <w:p>
             <w:pPr>
               <w:pStyle w:val="Compact"/>
-              <w:jc w:val="left"/>
-            </w:pPr>
-            <w:r>
+              <w:spacing w:before="20" w:after="20"/>
+              <w:jc w:val="left"/>
+            </w:pPr>
+            <w:r>
+              <w:rPr>
+                <w:sz w:val="18"/>
+              </w:rPr>
               <w:t xml:space="preserve">Composition root</w:t>
             </w:r>
           </w:p>
@@ -1697,11 +2380,13 @@
           <w:p>
             <w:pPr>
               <w:pStyle w:val="Compact"/>
-              <w:jc w:val="left"/>
-            </w:pPr>
-            <w:r>
-              <w:rPr>
-                <w:rStyle w:val="VerbatimChar"/>
+              <w:spacing w:before="20" w:after="20"/>
+              <w:jc w:val="left"/>
+            </w:pPr>
+            <w:r>
+              <w:rPr>
+                <w:rStyle w:val="VerbatimChar"/>
+                <w:sz w:val="18"/>
               </w:rPr>
               <w:t xml:space="preserve">src/bootstrap/container.js</w:t>
             </w:r>
@@ -1712,9 +2397,13 @@
           <w:p>
             <w:pPr>
               <w:pStyle w:val="Compact"/>
-              <w:jc w:val="left"/>
-            </w:pPr>
-            <w:r>
+              <w:spacing w:before="20" w:after="20"/>
+              <w:jc w:val="left"/>
+            </w:pPr>
+            <w:r>
+              <w:rPr>
+                <w:sz w:val="18"/>
+              </w:rPr>
               <w:t xml:space="preserve">Chooses adapters, wires services, registers event subscribers</w:t>
             </w:r>
           </w:p>
@@ -1726,9 +2415,13 @@
           <w:p>
             <w:pPr>
               <w:pStyle w:val="Compact"/>
-              <w:jc w:val="left"/>
-            </w:pPr>
-            <w:r>
+              <w:spacing w:before="20" w:after="20"/>
+              <w:jc w:val="left"/>
+            </w:pPr>
+            <w:r>
+              <w:rPr>
+                <w:sz w:val="18"/>
+              </w:rPr>
               <w:t xml:space="preserve">Persistence adapters</w:t>
             </w:r>
           </w:p>
@@ -1738,11 +2431,13 @@
           <w:p>
             <w:pPr>
               <w:pStyle w:val="Compact"/>
-              <w:jc w:val="left"/>
-            </w:pPr>
-            <w:r>
-              <w:rPr>
-                <w:rStyle w:val="VerbatimChar"/>
+              <w:spacing w:before="20" w:after="20"/>
+              <w:jc w:val="left"/>
+            </w:pPr>
+            <w:r>
+              <w:rPr>
+                <w:rStyle w:val="VerbatimChar"/>
+                <w:sz w:val="18"/>
               </w:rPr>
               <w:t xml:space="preserve">src/adapters/persistence/</w:t>
             </w:r>
@@ -1753,74 +2448,133 @@
           <w:p>
             <w:pPr>
               <w:pStyle w:val="Compact"/>
-              <w:jc w:val="left"/>
-            </w:pPr>
-            <w:r>
-              <w:rPr>
-                <w:rStyle w:val="VerbatimChar"/>
+              <w:spacing w:before="20" w:after="20"/>
+              <w:jc w:val="left"/>
+            </w:pPr>
+            <w:r>
+              <w:rPr>
+                <w:rStyle w:val="VerbatimChar"/>
+                <w:sz w:val="18"/>
               </w:rPr>
               <w:t xml:space="preserve">schema.js</w:t>
             </w:r>
             <w:r>
+              <w:rPr>
+                <w:sz w:val="18"/>
+              </w:rPr>
               <w:t xml:space="preserve"> </w:t>
             </w:r>
             <w:r>
+              <w:rPr>
+                <w:sz w:val="18"/>
+              </w:rPr>
               <w:t xml:space="preserve">(collection registry),</w:t>
             </w:r>
             <w:r>
+              <w:rPr>
+                <w:sz w:val="18"/>
+              </w:rPr>
               <w:t xml:space="preserve"> </w:t>
             </w:r>
             <w:r>
               <w:rPr>
                 <w:rStyle w:val="VerbatimChar"/>
+                <w:sz w:val="18"/>
+              </w:rPr>
+              <w:t xml:space="preserve">schemaSql.js</w:t>
+            </w:r>
+            <w:r>
+              <w:rPr>
+                <w:sz w:val="18"/>
+              </w:rPr>
+              <w:t xml:space="preserve">,</w:t>
+            </w:r>
+            <w:r>
+              <w:rPr>
+                <w:sz w:val="18"/>
+              </w:rPr>
+              <w:t xml:space="preserve"> </w:t>
+            </w:r>
+            <w:r>
+              <w:rPr>
+                <w:rStyle w:val="VerbatimChar"/>
+                <w:sz w:val="18"/>
               </w:rPr>
               <w:t xml:space="preserve">codec.js</w:t>
             </w:r>
             <w:r>
+              <w:rPr>
+                <w:sz w:val="18"/>
+              </w:rPr>
               <w:t xml:space="preserve">,</w:t>
             </w:r>
             <w:r>
+              <w:rPr>
+                <w:sz w:val="18"/>
+              </w:rPr>
               <w:t xml:space="preserve"> </w:t>
             </w:r>
             <w:r>
               <w:rPr>
                 <w:rStyle w:val="VerbatimChar"/>
+                <w:sz w:val="18"/>
               </w:rPr>
               <w:t xml:space="preserve">memoryStore.js</w:t>
             </w:r>
             <w:r>
+              <w:rPr>
+                <w:sz w:val="18"/>
+              </w:rPr>
               <w:t xml:space="preserve">,</w:t>
             </w:r>
             <w:r>
+              <w:rPr>
+                <w:sz w:val="18"/>
+              </w:rPr>
               <w:t xml:space="preserve"> </w:t>
             </w:r>
             <w:r>
               <w:rPr>
                 <w:rStyle w:val="VerbatimChar"/>
+                <w:sz w:val="18"/>
               </w:rPr>
               <w:t xml:space="preserve">postgresStore.js</w:t>
             </w:r>
             <w:r>
+              <w:rPr>
+                <w:sz w:val="18"/>
+              </w:rPr>
               <w:t xml:space="preserve">,</w:t>
             </w:r>
             <w:r>
+              <w:rPr>
+                <w:sz w:val="18"/>
+              </w:rPr>
               <w:t xml:space="preserve"> </w:t>
             </w:r>
             <w:r>
               <w:rPr>
                 <w:rStyle w:val="VerbatimChar"/>
+                <w:sz w:val="18"/>
               </w:rPr>
               <w:t xml:space="preserve">auditChain.js</w:t>
             </w:r>
             <w:r>
+              <w:rPr>
+                <w:sz w:val="18"/>
+              </w:rPr>
               <w:t xml:space="preserve">,</w:t>
             </w:r>
             <w:r>
+              <w:rPr>
+                <w:sz w:val="18"/>
+              </w:rPr>
               <w:t xml:space="preserve"> </w:t>
             </w:r>
             <w:r>
               <w:rPr>
                 <w:rStyle w:val="VerbatimChar"/>
+                <w:sz w:val="18"/>
               </w:rPr>
               <w:t xml:space="preserve">query.js</w:t>
             </w:r>
@@ -1833,9 +2587,13 @@
           <w:p>
             <w:pPr>
               <w:pStyle w:val="Compact"/>
-              <w:jc w:val="left"/>
-            </w:pPr>
-            <w:r>
+              <w:spacing w:before="20" w:after="20"/>
+              <w:jc w:val="left"/>
+            </w:pPr>
+            <w:r>
+              <w:rPr>
+                <w:sz w:val="18"/>
+              </w:rPr>
               <w:t xml:space="preserve">Messaging adapter</w:t>
             </w:r>
           </w:p>
@@ -1845,11 +2603,13 @@
           <w:p>
             <w:pPr>
               <w:pStyle w:val="Compact"/>
-              <w:jc w:val="left"/>
-            </w:pPr>
-            <w:r>
-              <w:rPr>
-                <w:rStyle w:val="VerbatimChar"/>
+              <w:spacing w:before="20" w:after="20"/>
+              <w:jc w:val="left"/>
+            </w:pPr>
+            <w:r>
+              <w:rPr>
+                <w:rStyle w:val="VerbatimChar"/>
+                <w:sz w:val="18"/>
               </w:rPr>
               <w:t xml:space="preserve">src/adapters/messaging/outboxEventBus.js</w:t>
             </w:r>
@@ -1860,9 +2620,13 @@
           <w:p>
             <w:pPr>
               <w:pStyle w:val="Compact"/>
-              <w:jc w:val="left"/>
-            </w:pPr>
-            <w:r>
+              <w:spacing w:before="20" w:after="20"/>
+              <w:jc w:val="left"/>
+            </w:pPr>
+            <w:r>
+              <w:rPr>
+                <w:sz w:val="18"/>
+              </w:rPr>
               <w:t xml:space="preserve">Outbox publish / relay / drain</w:t>
             </w:r>
           </w:p>
@@ -1874,9 +2638,13 @@
           <w:p>
             <w:pPr>
               <w:pStyle w:val="Compact"/>
-              <w:jc w:val="left"/>
-            </w:pPr>
-            <w:r>
+              <w:spacing w:before="20" w:after="20"/>
+              <w:jc w:val="left"/>
+            </w:pPr>
+            <w:r>
+              <w:rPr>
+                <w:sz w:val="18"/>
+              </w:rPr>
               <w:t xml:space="preserve">Integration adapters</w:t>
             </w:r>
           </w:p>
@@ -1886,11 +2654,13 @@
           <w:p>
             <w:pPr>
               <w:pStyle w:val="Compact"/>
-              <w:jc w:val="left"/>
-            </w:pPr>
-            <w:r>
-              <w:rPr>
-                <w:rStyle w:val="VerbatimChar"/>
+              <w:spacing w:before="20" w:after="20"/>
+              <w:jc w:val="left"/>
+            </w:pPr>
+            <w:r>
+              <w:rPr>
+                <w:rStyle w:val="VerbatimChar"/>
+                <w:sz w:val="18"/>
               </w:rPr>
               <w:t xml:space="preserve">src/adapters/integrations/</w:t>
             </w:r>
@@ -1901,10 +2671,27 @@
           <w:p>
             <w:pPr>
               <w:pStyle w:val="Compact"/>
-              <w:jc w:val="left"/>
-            </w:pPr>
-            <w:r>
-              <w:t xml:space="preserve">Sandbox VETC wallet, TASCO core, notifications, simulated caller, synthetic VETC source</w:t>
+              <w:spacing w:before="20" w:after="20"/>
+              <w:jc w:val="left"/>
+            </w:pPr>
+            <w:r>
+              <w:rPr>
+                <w:sz w:val="18"/>
+              </w:rPr>
+              <w:t xml:space="preserve">Sandbox VETC wallet, TASCO core and notification gateways (</w:t>
+            </w:r>
+            <w:r>
+              <w:rPr>
+                <w:rStyle w:val="VerbatimChar"/>
+                <w:sz w:val="18"/>
+              </w:rPr>
+              <w:t xml:space="preserve">mockGateways.js</w:t>
+            </w:r>
+            <w:r>
+              <w:rPr>
+                <w:sz w:val="18"/>
+              </w:rPr>
+              <w:t xml:space="preserve">), simulated caller, synthetic VETC source</w:t>
             </w:r>
           </w:p>
         </w:tc>
@@ -1915,9 +2702,13 @@
           <w:p>
             <w:pPr>
               <w:pStyle w:val="Compact"/>
-              <w:jc w:val="left"/>
-            </w:pPr>
-            <w:r>
+              <w:spacing w:before="20" w:after="20"/>
+              <w:jc w:val="left"/>
+            </w:pPr>
+            <w:r>
+              <w:rPr>
+                <w:sz w:val="18"/>
+              </w:rPr>
               <w:t xml:space="preserve">HTTP adapter</w:t>
             </w:r>
           </w:p>
@@ -1927,11 +2718,13 @@
           <w:p>
             <w:pPr>
               <w:pStyle w:val="Compact"/>
-              <w:jc w:val="left"/>
-            </w:pPr>
-            <w:r>
-              <w:rPr>
-                <w:rStyle w:val="VerbatimChar"/>
+              <w:spacing w:before="20" w:after="20"/>
+              <w:jc w:val="left"/>
+            </w:pPr>
+            <w:r>
+              <w:rPr>
+                <w:rStyle w:val="VerbatimChar"/>
+                <w:sz w:val="18"/>
               </w:rPr>
               <w:t xml:space="preserve">src/adapters/http/</w:t>
             </w:r>
@@ -1942,65 +2735,101 @@
           <w:p>
             <w:pPr>
               <w:pStyle w:val="Compact"/>
-              <w:jc w:val="left"/>
-            </w:pPr>
-            <w:r>
-              <w:rPr>
-                <w:rStyle w:val="VerbatimChar"/>
+              <w:spacing w:before="20" w:after="20"/>
+              <w:jc w:val="left"/>
+            </w:pPr>
+            <w:r>
+              <w:rPr>
+                <w:rStyle w:val="VerbatimChar"/>
+                <w:sz w:val="18"/>
               </w:rPr>
               <w:t xml:space="preserve">app.js</w:t>
             </w:r>
             <w:r>
+              <w:rPr>
+                <w:sz w:val="18"/>
+              </w:rPr>
               <w:t xml:space="preserve"> </w:t>
             </w:r>
             <w:r>
+              <w:rPr>
+                <w:sz w:val="18"/>
+              </w:rPr>
               <w:t xml:space="preserve">(pipeline),</w:t>
             </w:r>
             <w:r>
+              <w:rPr>
+                <w:sz w:val="18"/>
+              </w:rPr>
               <w:t xml:space="preserve"> </w:t>
             </w:r>
             <w:r>
               <w:rPr>
                 <w:rStyle w:val="VerbatimChar"/>
+                <w:sz w:val="18"/>
               </w:rPr>
               <w:t xml:space="preserve">routes.js</w:t>
             </w:r>
             <w:r>
+              <w:rPr>
+                <w:sz w:val="18"/>
+              </w:rPr>
               <w:t xml:space="preserve"> </w:t>
             </w:r>
             <w:r>
-              <w:t xml:space="preserve">(73 routes),</w:t>
-            </w:r>
-            <w:r>
+              <w:rPr>
+                <w:sz w:val="18"/>
+              </w:rPr>
+              <w:t xml:space="preserve">(80 operations),</w:t>
+            </w:r>
+            <w:r>
+              <w:rPr>
+                <w:sz w:val="18"/>
+              </w:rPr>
               <w:t xml:space="preserve"> </w:t>
             </w:r>
             <w:r>
               <w:rPr>
                 <w:rStyle w:val="VerbatimChar"/>
+                <w:sz w:val="18"/>
               </w:rPr>
               <w:t xml:space="preserve">router.js</w:t>
             </w:r>
             <w:r>
+              <w:rPr>
+                <w:sz w:val="18"/>
+              </w:rPr>
               <w:t xml:space="preserve">,</w:t>
             </w:r>
             <w:r>
+              <w:rPr>
+                <w:sz w:val="18"/>
+              </w:rPr>
               <w:t xml:space="preserve"> </w:t>
             </w:r>
             <w:r>
               <w:rPr>
                 <w:rStyle w:val="VerbatimChar"/>
+                <w:sz w:val="18"/>
               </w:rPr>
               <w:t xml:space="preserve">openapi.js</w:t>
             </w:r>
             <w:r>
+              <w:rPr>
+                <w:sz w:val="18"/>
+              </w:rPr>
               <w:t xml:space="preserve">,</w:t>
             </w:r>
             <w:r>
+              <w:rPr>
+                <w:sz w:val="18"/>
+              </w:rPr>
               <w:t xml:space="preserve"> </w:t>
             </w:r>
             <w:r>
               <w:rPr>
                 <w:rStyle w:val="VerbatimChar"/>
+                <w:sz w:val="18"/>
               </w:rPr>
               <w:t xml:space="preserve">security.js</w:t>
             </w:r>
@@ -2009,13 +2838,19 @@
       </w:tr>
       <w:tr>
         <w:tc>
-          <w:tcPr/>
-          <w:p>
-            <w:pPr>
-              <w:pStyle w:val="Compact"/>
-              <w:jc w:val="left"/>
-            </w:pPr>
-            <w:r>
+          <w:tcPr>
+            <w:noWrap/>
+          </w:tcPr>
+          <w:p>
+            <w:pPr>
+              <w:pStyle w:val="Compact"/>
+              <w:spacing w:before="20" w:after="20"/>
+              <w:jc w:val="left"/>
+            </w:pPr>
+            <w:r>
+              <w:rPr>
+                <w:sz w:val="18"/>
+              </w:rPr>
               <w:t xml:space="preserve">Processes</w:t>
             </w:r>
           </w:p>
@@ -2025,23 +2860,32 @@
           <w:p>
             <w:pPr>
               <w:pStyle w:val="Compact"/>
-              <w:jc w:val="left"/>
-            </w:pPr>
-            <w:r>
-              <w:rPr>
-                <w:rStyle w:val="VerbatimChar"/>
+              <w:spacing w:before="20" w:after="20"/>
+              <w:jc w:val="left"/>
+            </w:pPr>
+            <w:r>
+              <w:rPr>
+                <w:rStyle w:val="VerbatimChar"/>
+                <w:sz w:val="18"/>
               </w:rPr>
               <w:t xml:space="preserve">src/server.js</w:t>
             </w:r>
             <w:r>
+              <w:rPr>
+                <w:sz w:val="18"/>
+              </w:rPr>
               <w:t xml:space="preserve">,</w:t>
             </w:r>
             <w:r>
+              <w:rPr>
+                <w:sz w:val="18"/>
+              </w:rPr>
               <w:t xml:space="preserve"> </w:t>
             </w:r>
             <w:r>
               <w:rPr>
                 <w:rStyle w:val="VerbatimChar"/>
+                <w:sz w:val="18"/>
               </w:rPr>
               <w:t xml:space="preserve">src/jobs/cli.js</w:t>
             </w:r>
@@ -2052,9 +2896,13 @@
           <w:p>
             <w:pPr>
               <w:pStyle w:val="Compact"/>
-              <w:jc w:val="left"/>
-            </w:pPr>
-            <w:r>
+              <w:spacing w:before="20" w:after="20"/>
+              <w:jc w:val="left"/>
+            </w:pPr>
+            <w:r>
+              <w:rPr>
+                <w:sz w:val="18"/>
+              </w:rPr>
               <w:t xml:space="preserve">API server with outbox relay and graceful shutdown; batch jobs</w:t>
             </w:r>
           </w:p>
@@ -2062,13 +2910,19 @@
       </w:tr>
       <w:tr>
         <w:tc>
-          <w:tcPr/>
-          <w:p>
-            <w:pPr>
-              <w:pStyle w:val="Compact"/>
-              <w:jc w:val="left"/>
-            </w:pPr>
-            <w:r>
+          <w:tcPr>
+            <w:noWrap/>
+          </w:tcPr>
+          <w:p>
+            <w:pPr>
+              <w:pStyle w:val="Compact"/>
+              <w:spacing w:before="20" w:after="20"/>
+              <w:jc w:val="left"/>
+            </w:pPr>
+            <w:r>
+              <w:rPr>
+                <w:sz w:val="18"/>
+              </w:rPr>
               <w:t xml:space="preserve">Configuration</w:t>
             </w:r>
           </w:p>
@@ -2078,26 +2932,38 @@
           <w:p>
             <w:pPr>
               <w:pStyle w:val="Compact"/>
-              <w:jc w:val="left"/>
-            </w:pPr>
-            <w:r>
-              <w:rPr>
-                <w:rStyle w:val="VerbatimChar"/>
+              <w:spacing w:before="20" w:after="20"/>
+              <w:jc w:val="left"/>
+            </w:pPr>
+            <w:r>
+              <w:rPr>
+                <w:rStyle w:val="VerbatimChar"/>
+                <w:sz w:val="18"/>
               </w:rPr>
               <w:t xml:space="preserve">config/rules/*.json</w:t>
             </w:r>
             <w:r>
+              <w:rPr>
+                <w:sz w:val="18"/>
+              </w:rPr>
               <w:t xml:space="preserve"> </w:t>
             </w:r>
             <w:r>
-              <w:t xml:space="preserve">(20 rule kinds),</w:t>
-            </w:r>
-            <w:r>
+              <w:rPr>
+                <w:sz w:val="18"/>
+              </w:rPr>
+              <w:t xml:space="preserve">(21 rule kinds),</w:t>
+            </w:r>
+            <w:r>
+              <w:rPr>
+                <w:sz w:val="18"/>
+              </w:rPr>
               <w:t xml:space="preserve"> </w:t>
             </w:r>
             <w:r>
               <w:rPr>
                 <w:rStyle w:val="VerbatimChar"/>
+                <w:sz w:val="18"/>
               </w:rPr>
               <w:t xml:space="preserve">config/security/rbac.json</w:t>
             </w:r>
@@ -2108,23 +2974,33 @@
           <w:p>
             <w:pPr>
               <w:pStyle w:val="Compact"/>
-              <w:jc w:val="left"/>
-            </w:pPr>
-            <w:r>
-              <w:t xml:space="preserve">Business rules seeded as version 1; RBAC</w:t>
+              <w:spacing w:before="20" w:after="20"/>
+              <w:jc w:val="left"/>
+            </w:pPr>
+            <w:r>
+              <w:rPr>
+                <w:sz w:val="18"/>
+              </w:rPr>
+              <w:t xml:space="preserve">Business rules seeded as version 1; RBAC, separation-of-duties pairs, restricted rule kinds</w:t>
             </w:r>
           </w:p>
         </w:tc>
       </w:tr>
       <w:tr>
         <w:tc>
-          <w:tcPr/>
-          <w:p>
-            <w:pPr>
-              <w:pStyle w:val="Compact"/>
-              <w:jc w:val="left"/>
-            </w:pPr>
-            <w:r>
+          <w:tcPr>
+            <w:noWrap/>
+          </w:tcPr>
+          <w:p>
+            <w:pPr>
+              <w:pStyle w:val="Compact"/>
+              <w:spacing w:before="20" w:after="20"/>
+              <w:jc w:val="left"/>
+            </w:pPr>
+            <w:r>
+              <w:rPr>
+                <w:sz w:val="18"/>
+              </w:rPr>
               <w:t xml:space="preserve">Schema</w:t>
             </w:r>
           </w:p>
@@ -2134,47 +3010,132 @@
           <w:p>
             <w:pPr>
               <w:pStyle w:val="Compact"/>
-              <w:jc w:val="left"/>
-            </w:pPr>
-            <w:r>
-              <w:rPr>
-                <w:rStyle w:val="VerbatimChar"/>
+              <w:spacing w:before="20" w:after="20"/>
+              <w:jc w:val="left"/>
+            </w:pPr>
+            <w:r>
+              <w:rPr>
+                <w:rStyle w:val="VerbatimChar"/>
+                <w:sz w:val="18"/>
               </w:rPr>
               <w:t xml:space="preserve">db/migrations/001_init.sql</w:t>
             </w:r>
-          </w:p>
-        </w:tc>
-        <w:tc>
-          <w:tcPr/>
-          <w:p>
-            <w:pPr>
-              <w:pStyle w:val="Compact"/>
-              <w:jc w:val="left"/>
-            </w:pPr>
-            <w:r>
+            <w:r>
+              <w:rPr>
+                <w:sz w:val="18"/>
+              </w:rPr>
+              <w:t xml:space="preserve">,</w:t>
+            </w:r>
+            <w:r>
+              <w:rPr>
+                <w:sz w:val="18"/>
+              </w:rPr>
+              <w:t xml:space="preserve"> </w:t>
+            </w:r>
+            <w:r>
+              <w:rPr>
+                <w:rStyle w:val="VerbatimChar"/>
+                <w:sz w:val="18"/>
+              </w:rPr>
+              <w:t xml:space="preserve">002_integrity_hardening.sql</w:t>
+            </w:r>
+          </w:p>
+        </w:tc>
+        <w:tc>
+          <w:tcPr/>
+          <w:p>
+            <w:pPr>
+              <w:pStyle w:val="Compact"/>
+              <w:spacing w:before="20" w:after="20"/>
+              <w:jc w:val="left"/>
+            </w:pPr>
+            <w:r>
+              <w:rPr>
+                <w:sz w:val="18"/>
+              </w:rPr>
               <w:t xml:space="preserve">19 collection tables +</w:t>
             </w:r>
             <w:r>
+              <w:rPr>
+                <w:sz w:val="18"/>
+              </w:rPr>
               <w:t xml:space="preserve"> </w:t>
             </w:r>
             <w:r>
               <w:rPr>
                 <w:rStyle w:val="VerbatimChar"/>
+                <w:sz w:val="18"/>
               </w:rPr>
               <w:t xml:space="preserve">audit_log</w:t>
+            </w:r>
+            <w:r>
+              <w:rPr>
+                <w:sz w:val="18"/>
+              </w:rPr>
+              <w:t xml:space="preserve">; integrity hardening (one active rule version per kind,</w:t>
+            </w:r>
+            <w:r>
+              <w:rPr>
+                <w:sz w:val="18"/>
+              </w:rPr>
+              <w:t xml:space="preserve"> </w:t>
+            </w:r>
+            <w:r>
+              <w:rPr>
+                <w:rStyle w:val="VerbatimChar"/>
+                <w:sz w:val="18"/>
+              </w:rPr>
+              <w:t xml:space="preserve">TRUNCATE</w:t>
+            </w:r>
+            <w:r>
+              <w:rPr>
+                <w:sz w:val="18"/>
+              </w:rPr>
+              <w:t xml:space="preserve"> </w:t>
+            </w:r>
+            <w:r>
+              <w:rPr>
+                <w:sz w:val="18"/>
+              </w:rPr>
+              <w:t xml:space="preserve">block on</w:t>
+            </w:r>
+            <w:r>
+              <w:rPr>
+                <w:sz w:val="18"/>
+              </w:rPr>
+              <w:t xml:space="preserve"> </w:t>
+            </w:r>
+            <w:r>
+              <w:rPr>
+                <w:rStyle w:val="VerbatimChar"/>
+                <w:sz w:val="18"/>
+              </w:rPr>
+              <w:t xml:space="preserve">audit_log</w:t>
+            </w:r>
+            <w:r>
+              <w:rPr>
+                <w:sz w:val="18"/>
+              </w:rPr>
+              <w:t xml:space="preserve">, outbox status index)</w:t>
             </w:r>
           </w:p>
         </w:tc>
       </w:tr>
       <w:tr>
         <w:tc>
-          <w:tcPr/>
-          <w:p>
-            <w:pPr>
-              <w:pStyle w:val="Compact"/>
-              <w:jc w:val="left"/>
-            </w:pPr>
-            <w:r>
+          <w:tcPr>
+            <w:noWrap/>
+          </w:tcPr>
+          <w:p>
+            <w:pPr>
+              <w:pStyle w:val="Compact"/>
+              <w:spacing w:before="20" w:after="20"/>
+              <w:jc w:val="left"/>
+            </w:pPr>
+            <w:r>
+              <w:rPr>
+                <w:sz w:val="18"/>
+              </w:rPr>
               <w:t xml:space="preserve">Deployment</w:t>
             </w:r>
           </w:p>
@@ -2184,59 +3145,89 @@
           <w:p>
             <w:pPr>
               <w:pStyle w:val="Compact"/>
-              <w:jc w:val="left"/>
-            </w:pPr>
-            <w:r>
-              <w:rPr>
-                <w:rStyle w:val="VerbatimChar"/>
+              <w:spacing w:before="20" w:after="20"/>
+              <w:jc w:val="left"/>
+            </w:pPr>
+            <w:r>
+              <w:rPr>
+                <w:rStyle w:val="VerbatimChar"/>
+                <w:sz w:val="18"/>
               </w:rPr>
               <w:t xml:space="preserve">Dockerfile</w:t>
             </w:r>
             <w:r>
+              <w:rPr>
+                <w:sz w:val="18"/>
+              </w:rPr>
               <w:t xml:space="preserve">,</w:t>
             </w:r>
             <w:r>
+              <w:rPr>
+                <w:sz w:val="18"/>
+              </w:rPr>
               <w:t xml:space="preserve"> </w:t>
             </w:r>
             <w:r>
               <w:rPr>
                 <w:rStyle w:val="VerbatimChar"/>
+                <w:sz w:val="18"/>
               </w:rPr>
               <w:t xml:space="preserve">docker-compose.yml</w:t>
             </w:r>
             <w:r>
+              <w:rPr>
+                <w:sz w:val="18"/>
+              </w:rPr>
               <w:t xml:space="preserve">,</w:t>
             </w:r>
             <w:r>
+              <w:rPr>
+                <w:sz w:val="18"/>
+              </w:rPr>
               <w:t xml:space="preserve"> </w:t>
             </w:r>
             <w:r>
               <w:rPr>
                 <w:rStyle w:val="VerbatimChar"/>
+                <w:sz w:val="18"/>
               </w:rPr>
               <w:t xml:space="preserve">deploy/k8s/</w:t>
             </w:r>
             <w:r>
+              <w:rPr>
+                <w:sz w:val="18"/>
+              </w:rPr>
               <w:t xml:space="preserve">,</w:t>
             </w:r>
             <w:r>
+              <w:rPr>
+                <w:sz w:val="18"/>
+              </w:rPr>
               <w:t xml:space="preserve"> </w:t>
             </w:r>
             <w:r>
               <w:rPr>
                 <w:rStyle w:val="VerbatimChar"/>
+                <w:sz w:val="18"/>
               </w:rPr>
               <w:t xml:space="preserve">railway.json</w:t>
             </w:r>
             <w:r>
+              <w:rPr>
+                <w:sz w:val="18"/>
+              </w:rPr>
               <w:t xml:space="preserve">,</w:t>
             </w:r>
             <w:r>
+              <w:rPr>
+                <w:sz w:val="18"/>
+              </w:rPr>
               <w:t xml:space="preserve"> </w:t>
             </w:r>
             <w:r>
               <w:rPr>
                 <w:rStyle w:val="VerbatimChar"/>
+                <w:sz w:val="18"/>
               </w:rPr>
               <w:t xml:space="preserve">.github/workflows/ci.yml</w:t>
             </w:r>
@@ -2247,10 +3238,14 @@
           <w:p>
             <w:pPr>
               <w:pStyle w:val="Compact"/>
-              <w:jc w:val="left"/>
-            </w:pPr>
-            <w:r>
-              <w:t xml:space="preserve">See the deployment document</w:t>
+              <w:spacing w:before="20" w:after="20"/>
+              <w:jc w:val="left"/>
+            </w:pPr>
+            <w:r>
+              <w:rPr>
+                <w:sz w:val="18"/>
+              </w:rPr>
+              <w:t xml:space="preserve">See the Deployment and Infrastructure Architecture</w:t>
             </w:r>
           </w:p>
         </w:tc>
@@ -2348,7 +3343,26 @@
         <w:t xml:space="preserve">Infra</w:t>
       </w:r>
       <w:r>
-        <w:t xml:space="preserve">: a control delivered by the platform (Kubernetes, WAF, managed Postgres, CI) rather than by application code.</w:t>
+        <w:t xml:space="preserve">: a control delivered by the platform (Kubernetes, WAF, managed PostgreSQL, CI) rather than by application code.</w:t>
+      </w:r>
+    </w:p>
+    <w:p>
+      <w:pPr>
+        <w:numPr>
+          <w:ilvl w:val="0"/>
+          <w:numId w:val="1001"/>
+        </w:numPr>
+        <w:pStyle w:val="Compact"/>
+      </w:pPr>
+      <w:r>
+        <w:rPr>
+          <w:bCs/>
+          <w:b/>
+        </w:rPr>
+        <w:t xml:space="preserve">Fixed</w:t>
+      </w:r>
+      <w:r>
+        <w:t xml:space="preserve">: a finding from an earlier review that has been remediated in code; the mechanism is named where the finding is listed.</w:t>
       </w:r>
     </w:p>
     <w:bookmarkEnd w:id="46"/>
@@ -2375,7 +3389,7 @@
     </w:pPr>
     <w:r>
       <w:rPr>
-        <w:rFonts w:ascii="Arial" w:hAnsi="Arial"/>
+        <w:rFonts w:ascii="Calibri" w:hAnsi="Calibri"/>
         <w:sz w:val="16"/>
       </w:rPr>
       <w:t xml:space="preserve">Prepared by iorta TechNXT · Confidential · Page </w:t>
@@ -2420,7 +3434,7 @@
     </w:pPr>
     <w:r>
       <w:rPr>
-        <w:rFonts w:ascii="Arial" w:hAnsi="Arial"/>
+        <w:rFonts w:ascii="Calibri" w:hAnsi="Calibri"/>
         <w:color w:val="213368"/>
         <w:sz w:val="16"/>
       </w:rPr>
@@ -2615,9 +3629,9 @@
     <w:name w:val="Normal"/>
     <w:qFormat/>
     <w:rPr>
-      <w:rFonts w:ascii="Arial" w:cs="Arial" w:eastAsia="Arial" w:hAnsi="Arial"/>
+      <w:rFonts w:ascii="Calibri" w:cs="Calibri" w:eastAsia="Calibri" w:hAnsi="Calibri"/>
       <w:color w:val="121A33"/>
-      <w:sz w:val="21"/>
+      <w:sz w:val="22"/>
     </w:rPr>
   </w:style>
   <w:style w:styleId="BodyText" w:type="paragraph">
@@ -2629,9 +3643,9 @@
     </w:pPr>
     <w:qFormat/>
     <w:rPr>
-      <w:rFonts w:ascii="Arial" w:cs="Arial" w:eastAsia="Arial" w:hAnsi="Arial"/>
+      <w:rFonts w:ascii="Calibri" w:cs="Calibri" w:eastAsia="Calibri" w:hAnsi="Calibri"/>
       <w:color w:val="121A33"/>
-      <w:sz w:val="21"/>
+      <w:sz w:val="22"/>
     </w:rPr>
   </w:style>
   <w:style w:customStyle="1" w:styleId="FirstParagraph" w:type="paragraph">
@@ -2640,9 +3654,9 @@
     <w:next w:val="BodyText"/>
     <w:qFormat/>
     <w:rPr>
-      <w:rFonts w:ascii="Arial" w:cs="Arial" w:eastAsia="Arial" w:hAnsi="Arial"/>
+      <w:rFonts w:ascii="Calibri" w:cs="Calibri" w:eastAsia="Calibri" w:hAnsi="Calibri"/>
       <w:color w:val="121A33"/>
-      <w:sz w:val="21"/>
+      <w:sz w:val="22"/>
     </w:rPr>
   </w:style>
   <w:style w:customStyle="1" w:styleId="Compact" w:type="paragraph">
@@ -2653,9 +3667,9 @@
       <w:spacing w:after="36" w:before="36"/>
     </w:pPr>
     <w:rPr>
-      <w:rFonts w:ascii="Arial" w:cs="Arial" w:eastAsia="Arial" w:hAnsi="Arial"/>
+      <w:rFonts w:ascii="Calibri" w:cs="Calibri" w:eastAsia="Calibri" w:hAnsi="Calibri"/>
       <w:color w:val="121A33"/>
-      <w:sz w:val="21"/>
+      <w:sz w:val="22"/>
     </w:rPr>
   </w:style>
   <w:style w:styleId="Title" w:type="paragraph">
@@ -2670,11 +3684,11 @@
       <w:jc w:val="center"/>
     </w:pPr>
     <w:rPr>
-      <w:rFonts w:ascii="Arial" w:asciiTheme="majorHAnsi" w:cs="Arial" w:cstheme="majorBidi" w:eastAsia="Arial" w:eastAsiaTheme="majorEastAsia" w:hAnsi="Arial" w:hAnsiTheme="majorHAnsi"/>
+      <w:rFonts w:ascii="Calibri" w:asciiTheme="majorHAnsi" w:cs="Calibri" w:cstheme="majorBidi" w:eastAsia="Calibri" w:eastAsiaTheme="majorEastAsia" w:hAnsi="Calibri" w:hAnsiTheme="majorHAnsi"/>
       <w:b/>
       <w:bCs/>
       <w:color w:val="213368"/>
-      <w:sz w:val="48"/>
+      <w:sz w:val="52"/>
       <w:szCs w:val="36"/>
     </w:rPr>
   </w:style>
@@ -2690,7 +3704,7 @@
       <w:jc w:val="center"/>
     </w:pPr>
     <w:rPr>
-      <w:rFonts w:ascii="Arial" w:cs="Arial" w:eastAsia="Arial" w:hAnsi="Arial"/>
+      <w:rFonts w:ascii="Calibri" w:cs="Calibri" w:eastAsia="Calibri" w:hAnsi="Calibri"/>
       <w:b w:val="0"/>
       <w:color w:val="0B6B66"/>
       <w:sz w:val="26"/>
@@ -2959,9 +3973,9 @@
       <w:ind w:firstLine="0" w:left="480" w:right="480"/>
     </w:pPr>
     <w:rPr>
-      <w:rFonts w:ascii="Arial" w:cs="Arial" w:eastAsia="Arial" w:hAnsi="Arial"/>
+      <w:rFonts w:ascii="Calibri" w:cs="Calibri" w:eastAsia="Calibri" w:hAnsi="Calibri"/>
       <w:color w:val="121A33"/>
-      <w:sz w:val="21"/>
+      <w:sz w:val="22"/>
     </w:rPr>
   </w:style>
   <w:style w:styleId="FootnoteText" w:type="paragraph">
@@ -2984,7 +3998,7 @@
     <w:unhideWhenUsed/>
     <w:qFormat/>
     <w:rPr>
-      <w:rFonts w:ascii="Arial" w:cs="Arial" w:eastAsia="Arial" w:hAnsi="Arial"/>
+      <w:rFonts w:ascii="Calibri" w:cs="Calibri" w:eastAsia="Calibri" w:hAnsi="Calibri"/>
       <w:sz w:val="18"/>
     </w:rPr>
     <w:tblPr>
@@ -3080,7 +4094,8 @@
     <w:basedOn w:val="BodyTextChar"/>
     <w:rPr>
       <w:rFonts w:ascii="Consolas" w:cs="Consolas" w:eastAsia="Consolas" w:hAnsi="Consolas"/>
-      <w:sz w:val="17"/>
+      <w:color w:val="2A3A6E"/>
+      <w:sz w:val="18"/>
     </w:rPr>
   </w:style>
   <w:style w:customStyle="1" w:styleId="SectionNumber" w:type="character">

</xml_diff>